<commit_message>
Sync with offline progress. Map Module and Event base
</commit_message>
<xml_diff>
--- a/New Microsoft Word Document.docx
+++ b/New Microsoft Word Document.docx
@@ -1,6 +1,6 @@
 
 <file path=word/document.xml><?xml version="1.0" encoding="utf-8"?>
-<w:document xmlns:wpc="http://schemas.microsoft.com/office/word/2010/wordprocessingCanvas" xmlns:cx="http://schemas.microsoft.com/office/drawing/2014/chartex" xmlns:cx1="http://schemas.microsoft.com/office/drawing/2015/9/8/chartex" xmlns:cx2="http://schemas.microsoft.com/office/drawing/2015/10/21/chartex" xmlns:cx3="http://schemas.microsoft.com/office/drawing/2016/5/9/chartex" xmlns:cx4="http://schemas.microsoft.com/office/drawing/2016/5/10/chartex" xmlns:cx5="http://schemas.microsoft.com/office/drawing/2016/5/11/chartex" xmlns:cx6="http://schemas.microsoft.com/office/drawing/2016/5/12/chartex" xmlns:cx7="http://schemas.microsoft.com/office/drawing/2016/5/13/chartex" xmlns:cx8="http://schemas.microsoft.com/office/drawing/2016/5/14/chartex" xmlns:mc="http://schemas.openxmlformats.org/markup-compatibility/2006" xmlns:aink="http://schemas.microsoft.com/office/drawing/2016/ink" xmlns:am3d="http://schemas.microsoft.com/office/drawing/2017/model3d" xmlns:o="urn:schemas-microsoft-com:office:office" xmlns:r="http://schemas.openxmlformats.org/officeDocument/2006/relationships" xmlns:m="http://schemas.openxmlformats.org/officeDocument/2006/math" xmlns:v="urn:schemas-microsoft-com:vml" xmlns:wp14="http://schemas.microsoft.com/office/word/2010/wordprocessingDrawing" xmlns:wp="http://schemas.openxmlformats.org/drawingml/2006/wordprocessingDrawing" xmlns:w10="urn:schemas-microsoft-com:office:word" xmlns:w="http://schemas.openxmlformats.org/wordprocessingml/2006/main" xmlns:w14="http://schemas.microsoft.com/office/word/2010/wordml" xmlns:w15="http://schemas.microsoft.com/office/word/2012/wordml" xmlns:w16cid="http://schemas.microsoft.com/office/word/2016/wordml/cid" xmlns:w16se="http://schemas.microsoft.com/office/word/2015/wordml/symex" xmlns:wpg="http://schemas.microsoft.com/office/word/2010/wordprocessingGroup" xmlns:wpi="http://schemas.microsoft.com/office/word/2010/wordprocessingInk" xmlns:wne="http://schemas.microsoft.com/office/word/2006/wordml" xmlns:wps="http://schemas.microsoft.com/office/word/2010/wordprocessingShape" mc:Ignorable="w14 w15 w16se w16cid wp14">
+<w:document xmlns:wpc="http://schemas.microsoft.com/office/word/2010/wordprocessingCanvas" xmlns:cx="http://schemas.microsoft.com/office/drawing/2014/chartex" xmlns:cx1="http://schemas.microsoft.com/office/drawing/2015/9/8/chartex" xmlns:cx2="http://schemas.microsoft.com/office/drawing/2015/10/21/chartex" xmlns:cx3="http://schemas.microsoft.com/office/drawing/2016/5/9/chartex" xmlns:cx4="http://schemas.microsoft.com/office/drawing/2016/5/10/chartex" xmlns:cx5="http://schemas.microsoft.com/office/drawing/2016/5/11/chartex" xmlns:cx6="http://schemas.microsoft.com/office/drawing/2016/5/12/chartex" xmlns:cx7="http://schemas.microsoft.com/office/drawing/2016/5/13/chartex" xmlns:cx8="http://schemas.microsoft.com/office/drawing/2016/5/14/chartex" xmlns:mc="http://schemas.openxmlformats.org/markup-compatibility/2006" xmlns:aink="http://schemas.microsoft.com/office/drawing/2016/ink" xmlns:am3d="http://schemas.microsoft.com/office/drawing/2017/model3d" xmlns:o="urn:schemas-microsoft-com:office:office" xmlns:oel="http://schemas.microsoft.com/office/2019/extlst" xmlns:r="http://schemas.openxmlformats.org/officeDocument/2006/relationships" xmlns:m="http://schemas.openxmlformats.org/officeDocument/2006/math" xmlns:v="urn:schemas-microsoft-com:vml" xmlns:wp14="http://schemas.microsoft.com/office/word/2010/wordprocessingDrawing" xmlns:wp="http://schemas.openxmlformats.org/drawingml/2006/wordprocessingDrawing" xmlns:w10="urn:schemas-microsoft-com:office:word" xmlns:w="http://schemas.openxmlformats.org/wordprocessingml/2006/main" xmlns:w14="http://schemas.microsoft.com/office/word/2010/wordml" xmlns:w15="http://schemas.microsoft.com/office/word/2012/wordml" xmlns:w16cex="http://schemas.microsoft.com/office/word/2018/wordml/cex" xmlns:w16cid="http://schemas.microsoft.com/office/word/2016/wordml/cid" xmlns:w16="http://schemas.microsoft.com/office/word/2018/wordml" xmlns:w16du="http://schemas.microsoft.com/office/word/2023/wordml/word16du" xmlns:w16sdtdh="http://schemas.microsoft.com/office/word/2020/wordml/sdtdatahash" xmlns:w16sdtfl="http://schemas.microsoft.com/office/word/2024/wordml/sdtformatlock" xmlns:w16se="http://schemas.microsoft.com/office/word/2015/wordml/symex" xmlns:wpg="http://schemas.microsoft.com/office/word/2010/wordprocessingGroup" xmlns:wpi="http://schemas.microsoft.com/office/word/2010/wordprocessingInk" xmlns:wne="http://schemas.microsoft.com/office/word/2006/wordml" xmlns:wps="http://schemas.microsoft.com/office/word/2010/wordprocessingShape" mc:Ignorable="w14 w15 w16se w16cid w16 w16cex w16sdtdh w16sdtfl w16du wp14">
   <w:body>
     <w:p>
       <w:pPr>
@@ -191,6 +191,332 @@
         <w:rPr>
           <w:lang w:val="en-US"/>
         </w:rPr>
+        <w:t>Variables</w:t>
+      </w:r>
+    </w:p>
+    <w:p>
+      <w:pPr>
+        <w:pStyle w:val="ListParagraph"/>
+        <w:numPr>
+          <w:ilvl w:val="0"/>
+          <w:numId w:val="1"/>
+        </w:numPr>
+        <w:rPr>
+          <w:lang w:val="en-US"/>
+        </w:rPr>
+      </w:pPr>
+      <w:r>
+        <w:rPr>
+          <w:lang w:val="en-US"/>
+        </w:rPr>
+        <w:t>entity_name : string</w:t>
+      </w:r>
+    </w:p>
+    <w:p>
+      <w:pPr>
+        <w:pStyle w:val="ListParagraph"/>
+        <w:numPr>
+          <w:ilvl w:val="0"/>
+          <w:numId w:val="1"/>
+        </w:numPr>
+        <w:rPr>
+          <w:lang w:val="en-US"/>
+        </w:rPr>
+      </w:pPr>
+      <w:r>
+        <w:rPr>
+          <w:lang w:val="en-US"/>
+        </w:rPr>
+        <w:t>target : Entity</w:t>
+      </w:r>
+    </w:p>
+    <w:p>
+      <w:pPr>
+        <w:pStyle w:val="ListParagraph"/>
+        <w:numPr>
+          <w:ilvl w:val="0"/>
+          <w:numId w:val="1"/>
+        </w:numPr>
+        <w:rPr>
+          <w:lang w:val="en-US"/>
+        </w:rPr>
+      </w:pPr>
+      <w:r>
+        <w:rPr>
+          <w:lang w:val="en-US"/>
+        </w:rPr>
+        <w:t>max_hp : float</w:t>
+      </w:r>
+    </w:p>
+    <w:p>
+      <w:pPr>
+        <w:pStyle w:val="ListParagraph"/>
+        <w:numPr>
+          <w:ilvl w:val="0"/>
+          <w:numId w:val="1"/>
+        </w:numPr>
+        <w:rPr>
+          <w:lang w:val="en-US"/>
+        </w:rPr>
+      </w:pPr>
+      <w:r>
+        <w:rPr>
+          <w:lang w:val="en-US"/>
+        </w:rPr>
+        <w:t>current_hp : float</w:t>
+      </w:r>
+    </w:p>
+    <w:p>
+      <w:pPr>
+        <w:pStyle w:val="ListParagraph"/>
+        <w:numPr>
+          <w:ilvl w:val="0"/>
+          <w:numId w:val="1"/>
+        </w:numPr>
+        <w:rPr>
+          <w:lang w:val="en-US"/>
+        </w:rPr>
+      </w:pPr>
+      <w:r>
+        <w:rPr>
+          <w:lang w:val="en-US"/>
+        </w:rPr>
+        <w:t>current_block : float</w:t>
+      </w:r>
+    </w:p>
+    <w:p>
+      <w:pPr>
+        <w:pStyle w:val="ListParagraph"/>
+        <w:numPr>
+          <w:ilvl w:val="0"/>
+          <w:numId w:val="1"/>
+        </w:numPr>
+        <w:rPr>
+          <w:lang w:val="en-US"/>
+        </w:rPr>
+      </w:pPr>
+      <w:r>
+        <w:rPr>
+          <w:lang w:val="en-US"/>
+        </w:rPr>
+        <w:t>base_atk : float</w:t>
+      </w:r>
+    </w:p>
+    <w:p>
+      <w:pPr>
+        <w:pStyle w:val="ListParagraph"/>
+        <w:numPr>
+          <w:ilvl w:val="0"/>
+          <w:numId w:val="1"/>
+        </w:numPr>
+        <w:rPr>
+          <w:lang w:val="en-US"/>
+        </w:rPr>
+      </w:pPr>
+      <w:r>
+        <w:rPr>
+          <w:lang w:val="en-US"/>
+        </w:rPr>
+        <w:t>effective_atk</w:t>
+      </w:r>
+      <w:r>
+        <w:rPr>
+          <w:lang w:val="en-US"/>
+        </w:rPr>
+        <w:t xml:space="preserve"> : float</w:t>
+      </w:r>
+    </w:p>
+    <w:p>
+      <w:pPr>
+        <w:pStyle w:val="ListParagraph"/>
+        <w:numPr>
+          <w:ilvl w:val="0"/>
+          <w:numId w:val="1"/>
+        </w:numPr>
+        <w:rPr>
+          <w:lang w:val="en-US"/>
+        </w:rPr>
+      </w:pPr>
+      <w:r>
+        <w:rPr>
+          <w:lang w:val="en-US"/>
+        </w:rPr>
+        <w:t>base_block</w:t>
+      </w:r>
+      <w:r>
+        <w:rPr>
+          <w:lang w:val="en-US"/>
+        </w:rPr>
+        <w:t xml:space="preserve"> : float</w:t>
+      </w:r>
+    </w:p>
+    <w:p>
+      <w:pPr>
+        <w:pStyle w:val="ListParagraph"/>
+        <w:numPr>
+          <w:ilvl w:val="0"/>
+          <w:numId w:val="1"/>
+        </w:numPr>
+        <w:rPr>
+          <w:lang w:val="en-US"/>
+        </w:rPr>
+      </w:pPr>
+      <w:r>
+        <w:rPr>
+          <w:lang w:val="en-US"/>
+        </w:rPr>
+        <w:t>effective_block</w:t>
+      </w:r>
+      <w:r>
+        <w:rPr>
+          <w:lang w:val="en-US"/>
+        </w:rPr>
+        <w:t xml:space="preserve"> : float</w:t>
+      </w:r>
+    </w:p>
+    <w:p>
+      <w:pPr>
+        <w:pStyle w:val="ListParagraph"/>
+        <w:numPr>
+          <w:ilvl w:val="0"/>
+          <w:numId w:val="1"/>
+        </w:numPr>
+        <w:rPr>
+          <w:lang w:val="en-US"/>
+        </w:rPr>
+      </w:pPr>
+      <w:r>
+        <w:rPr>
+          <w:lang w:val="en-US"/>
+        </w:rPr>
+        <w:t>base_heal</w:t>
+      </w:r>
+      <w:r>
+        <w:rPr>
+          <w:lang w:val="en-US"/>
+        </w:rPr>
+        <w:t xml:space="preserve"> : float</w:t>
+      </w:r>
+    </w:p>
+    <w:p>
+      <w:pPr>
+        <w:pStyle w:val="ListParagraph"/>
+        <w:numPr>
+          <w:ilvl w:val="0"/>
+          <w:numId w:val="1"/>
+        </w:numPr>
+        <w:rPr>
+          <w:lang w:val="en-US"/>
+        </w:rPr>
+      </w:pPr>
+      <w:r>
+        <w:rPr>
+          <w:lang w:val="en-US"/>
+        </w:rPr>
+        <w:t>effective_heal</w:t>
+      </w:r>
+      <w:r>
+        <w:rPr>
+          <w:lang w:val="en-US"/>
+        </w:rPr>
+        <w:t xml:space="preserve"> : float</w:t>
+      </w:r>
+    </w:p>
+    <w:p>
+      <w:pPr>
+        <w:pStyle w:val="ListParagraph"/>
+        <w:numPr>
+          <w:ilvl w:val="0"/>
+          <w:numId w:val="1"/>
+        </w:numPr>
+        <w:rPr>
+          <w:lang w:val="en-US"/>
+        </w:rPr>
+      </w:pPr>
+      <w:r>
+        <w:rPr>
+          <w:lang w:val="en-US"/>
+        </w:rPr>
+        <w:t>charge_storage : int</w:t>
+      </w:r>
+    </w:p>
+    <w:p>
+      <w:pPr>
+        <w:pStyle w:val="ListParagraph"/>
+        <w:numPr>
+          <w:ilvl w:val="0"/>
+          <w:numId w:val="1"/>
+        </w:numPr>
+        <w:rPr>
+          <w:lang w:val="en-US"/>
+        </w:rPr>
+      </w:pPr>
+      <w:r>
+        <w:rPr>
+          <w:lang w:val="en-US"/>
+        </w:rPr>
+        <w:t>base_charge : int</w:t>
+      </w:r>
+    </w:p>
+    <w:p>
+      <w:pPr>
+        <w:pStyle w:val="ListParagraph"/>
+        <w:numPr>
+          <w:ilvl w:val="0"/>
+          <w:numId w:val="1"/>
+        </w:numPr>
+        <w:rPr>
+          <w:lang w:val="en-US"/>
+        </w:rPr>
+      </w:pPr>
+      <w:r>
+        <w:rPr>
+          <w:lang w:val="en-US"/>
+        </w:rPr>
+        <w:t xml:space="preserve">effective_charge </w:t>
+      </w:r>
+      <w:r>
+        <w:rPr>
+          <w:lang w:val="en-US"/>
+        </w:rPr>
+        <w:t xml:space="preserve"> : </w:t>
+      </w:r>
+      <w:r>
+        <w:rPr>
+          <w:lang w:val="en-US"/>
+        </w:rPr>
+        <w:t>int</w:t>
+      </w:r>
+    </w:p>
+    <w:p>
+      <w:pPr>
+        <w:pStyle w:val="ListParagraph"/>
+        <w:numPr>
+          <w:ilvl w:val="0"/>
+          <w:numId w:val="1"/>
+        </w:numPr>
+        <w:rPr>
+          <w:lang w:val="en-US"/>
+        </w:rPr>
+      </w:pPr>
+      <w:r>
+        <w:rPr>
+          <w:lang w:val="en-US"/>
+        </w:rPr>
+        <w:t>h_flip : boolean</w:t>
+      </w:r>
+    </w:p>
+    <w:p>
+      <w:pPr>
+        <w:pStyle w:val="Heading4"/>
+        <w:rPr>
+          <w:lang w:val="en-US"/>
+        </w:rPr>
+      </w:pPr>
+      <w:r>
+        <w:rPr>
+          <w:lang w:val="en-US"/>
+        </w:rPr>
         <w:t>damaged</w:t>
       </w:r>
       <w:r>
@@ -310,6 +636,7 @@
         <w:rPr>
           <w:lang w:val="en-US"/>
         </w:rPr>
+        <w:lastRenderedPageBreak/>
         <w:t>Enemy</w:t>
       </w:r>
     </w:p>
@@ -927,6 +1254,7 @@
         <w:rPr>
           <w:lang w:val="en-US"/>
         </w:rPr>
+        <w:lastRenderedPageBreak/>
         <w:t>Debug</w:t>
       </w:r>
     </w:p>
@@ -1168,148 +1496,368 @@
         <w:rPr>
           <w:lang w:val="en-US"/>
         </w:rPr>
+        <w:t>set_seed</w:t>
+      </w:r>
+      <w:r>
+        <w:rPr>
+          <w:lang w:val="en-US"/>
+        </w:rPr>
+        <w:t>(Int)</w:t>
+      </w:r>
+    </w:p>
+    <w:p>
+      <w:pPr>
+        <w:pStyle w:val="ListParagraph"/>
+        <w:numPr>
+          <w:ilvl w:val="0"/>
+          <w:numId w:val="1"/>
+        </w:numPr>
+        <w:rPr>
+          <w:lang w:val="en-US"/>
+        </w:rPr>
+      </w:pPr>
+      <w:r>
+        <w:rPr>
+          <w:lang w:val="en-US"/>
+        </w:rPr>
+        <w:t>sets rng state</w:t>
+      </w:r>
+    </w:p>
+    <w:p>
+      <w:pPr>
+        <w:rPr>
+          <w:lang w:val="en-US"/>
+        </w:rPr>
+      </w:pPr>
+    </w:p>
+    <w:p>
+      <w:pPr>
+        <w:pStyle w:val="Heading4"/>
+        <w:rPr>
+          <w:lang w:val="en-US"/>
+        </w:rPr>
+      </w:pPr>
+      <w:r>
+        <w:rPr>
+          <w:lang w:val="en-US"/>
+        </w:rPr>
+        <w:t>set_state</w:t>
+      </w:r>
+      <w:r>
+        <w:rPr>
+          <w:lang w:val="en-US"/>
+        </w:rPr>
+        <w:t>(Int)</w:t>
+      </w:r>
+    </w:p>
+    <w:p>
+      <w:pPr>
+        <w:pStyle w:val="ListParagraph"/>
+        <w:numPr>
+          <w:ilvl w:val="0"/>
+          <w:numId w:val="1"/>
+        </w:numPr>
+        <w:rPr>
+          <w:lang w:val="en-US"/>
+        </w:rPr>
+      </w:pPr>
+      <w:r>
+        <w:rPr>
+          <w:lang w:val="en-US"/>
+        </w:rPr>
+        <w:t>sets rng state</w:t>
+      </w:r>
+    </w:p>
+    <w:p>
+      <w:pPr>
+        <w:pStyle w:val="Heading4"/>
+        <w:rPr>
+          <w:lang w:val="en-US"/>
+        </w:rPr>
+      </w:pPr>
+      <w:r>
+        <w:rPr>
+          <w:lang w:val="en-US"/>
+        </w:rPr>
+        <w:t>pick_from</w:t>
+      </w:r>
+      <w:r>
+        <w:rPr>
+          <w:lang w:val="en-US"/>
+        </w:rPr>
+        <w:t>(Array, Array)</w:t>
+      </w:r>
+    </w:p>
+    <w:p>
+      <w:pPr>
+        <w:pStyle w:val="ListParagraph"/>
+        <w:numPr>
+          <w:ilvl w:val="0"/>
+          <w:numId w:val="1"/>
+        </w:numPr>
+        <w:rPr>
+          <w:lang w:val="en-US"/>
+        </w:rPr>
+      </w:pPr>
+      <w:r>
+        <w:rPr>
+          <w:lang w:val="en-US"/>
+        </w:rPr>
+        <w:t>returns an object from an array</w:t>
+      </w:r>
+    </w:p>
+    <w:p>
+      <w:pPr>
+        <w:pStyle w:val="ListParagraph"/>
+        <w:numPr>
+          <w:ilvl w:val="0"/>
+          <w:numId w:val="1"/>
+        </w:numPr>
+        <w:rPr>
+          <w:lang w:val="en-US"/>
+        </w:rPr>
+      </w:pPr>
+      <w:r>
+        <w:rPr>
+          <w:lang w:val="en-US"/>
+        </w:rPr>
+        <w:t>can take in extra array for weights to do weighted randomization</w:t>
+      </w:r>
+    </w:p>
+    <w:p>
+      <w:pPr>
+        <w:pStyle w:val="Heading4"/>
+        <w:rPr>
+          <w:b/>
+          <w:lang w:val="en-US"/>
+        </w:rPr>
+      </w:pPr>
+      <w:r>
+        <w:rPr>
+          <w:lang w:val="en-US"/>
+        </w:rPr>
+        <w:t>randf</w:t>
+      </w:r>
+      <w:r>
+        <w:rPr>
+          <w:lang w:val="en-US"/>
+        </w:rPr>
+        <w:t>()</w:t>
+      </w:r>
+    </w:p>
+    <w:p>
+      <w:pPr>
+        <w:pStyle w:val="ListParagraph"/>
+        <w:numPr>
+          <w:ilvl w:val="0"/>
+          <w:numId w:val="1"/>
+        </w:numPr>
+        <w:rPr>
+          <w:lang w:val="en-US"/>
+        </w:rPr>
+      </w:pPr>
+      <w:r>
+        <w:rPr>
+          <w:lang w:val="en-US"/>
+        </w:rPr>
+        <w:t>returns random float from 0 to 1</w:t>
+      </w:r>
+    </w:p>
+    <w:p>
+      <w:pPr>
+        <w:pStyle w:val="Heading4"/>
+        <w:rPr>
+          <w:lang w:val="en-US"/>
+        </w:rPr>
+      </w:pPr>
+      <w:r>
+        <w:rPr>
+          <w:lang w:val="en-US"/>
+        </w:rPr>
+        <w:t>randf_range</w:t>
+      </w:r>
+      <w:r>
+        <w:rPr>
+          <w:lang w:val="en-US"/>
+        </w:rPr>
+        <w:t>(Float, Float)</w:t>
+      </w:r>
+    </w:p>
+    <w:p>
+      <w:pPr>
+        <w:pStyle w:val="ListParagraph"/>
+        <w:numPr>
+          <w:ilvl w:val="0"/>
+          <w:numId w:val="1"/>
+        </w:numPr>
+        <w:rPr>
+          <w:lang w:val="en-US"/>
+        </w:rPr>
+      </w:pPr>
+      <w:r>
+        <w:rPr>
+          <w:lang w:val="en-US"/>
+        </w:rPr>
+        <w:t>returns random float from given range (inclusive)</w:t>
+      </w:r>
+    </w:p>
+    <w:p>
+      <w:pPr>
+        <w:pStyle w:val="Heading4"/>
+        <w:rPr>
+          <w:lang w:val="en-US"/>
+        </w:rPr>
+      </w:pPr>
+      <w:r>
+        <w:rPr>
+          <w:lang w:val="en-US"/>
+        </w:rPr>
+        <w:t>randfn</w:t>
+      </w:r>
+      <w:r>
+        <w:rPr>
+          <w:lang w:val="en-US"/>
+        </w:rPr>
+        <w:t>(Float, Float)</w:t>
+      </w:r>
+    </w:p>
+    <w:p>
+      <w:pPr>
+        <w:pStyle w:val="ListParagraph"/>
+        <w:numPr>
+          <w:ilvl w:val="0"/>
+          <w:numId w:val="1"/>
+        </w:numPr>
+        <w:rPr>
+          <w:lang w:val="en-US"/>
+        </w:rPr>
+      </w:pPr>
+      <w:r>
+        <w:rPr>
+          <w:lang w:val="en-US"/>
+        </w:rPr>
+        <w:t>returns random float with normal distribution probability</w:t>
+      </w:r>
+    </w:p>
+    <w:p>
+      <w:pPr>
+        <w:pStyle w:val="ListParagraph"/>
+        <w:numPr>
+          <w:ilvl w:val="0"/>
+          <w:numId w:val="1"/>
+        </w:numPr>
+        <w:rPr>
+          <w:lang w:val="en-US"/>
+        </w:rPr>
+      </w:pPr>
+      <w:r>
+        <w:rPr>
+          <w:lang w:val="en-US"/>
+        </w:rPr>
+        <w:t>can take in mean and deviation inputs</w:t>
+      </w:r>
+    </w:p>
+    <w:p>
+      <w:pPr>
+        <w:pStyle w:val="Heading4"/>
+        <w:rPr>
+          <w:lang w:val="en-US"/>
+        </w:rPr>
+      </w:pPr>
+      <w:r>
+        <w:rPr>
+          <w:lang w:val="en-US"/>
+        </w:rPr>
+        <w:t>randi</w:t>
+      </w:r>
+      <w:r>
+        <w:rPr>
+          <w:lang w:val="en-US"/>
+        </w:rPr>
+        <w:t>()</w:t>
+      </w:r>
+    </w:p>
+    <w:p>
+      <w:pPr>
+        <w:pStyle w:val="ListParagraph"/>
+        <w:numPr>
+          <w:ilvl w:val="0"/>
+          <w:numId w:val="1"/>
+        </w:numPr>
+        <w:rPr>
+          <w:lang w:val="en-US"/>
+        </w:rPr>
+      </w:pPr>
+      <w:r>
+        <w:rPr>
+          <w:lang w:val="en-US"/>
+        </w:rPr>
+        <w:t xml:space="preserve">returns random unsigned integer from 0 to </w:t>
+      </w:r>
+      <w:r>
+        <w:rPr>
+          <w:lang w:val="en-US"/>
+        </w:rPr>
+        <w:t>4294967295</w:t>
+      </w:r>
+      <w:r>
+        <w:rPr>
+          <w:lang w:val="en-US"/>
+        </w:rPr>
+        <w:t xml:space="preserve"> (2^32) inclusive</w:t>
+      </w:r>
+    </w:p>
+    <w:p>
+      <w:pPr>
+        <w:pStyle w:val="Heading4"/>
+        <w:rPr>
+          <w:lang w:val="en-US"/>
+        </w:rPr>
+      </w:pPr>
+      <w:r>
+        <w:rPr>
+          <w:lang w:val="en-US"/>
+        </w:rPr>
+        <w:t>randi_range</w:t>
+      </w:r>
+      <w:r>
+        <w:rPr>
+          <w:lang w:val="en-US"/>
+        </w:rPr>
+        <w:t>(Int, Int)</w:t>
+      </w:r>
+    </w:p>
+    <w:p>
+      <w:pPr>
+        <w:pStyle w:val="ListParagraph"/>
+        <w:numPr>
+          <w:ilvl w:val="0"/>
+          <w:numId w:val="1"/>
+        </w:numPr>
+        <w:rPr>
+          <w:lang w:val="en-US"/>
+        </w:rPr>
+      </w:pPr>
+      <w:r>
+        <w:rPr>
+          <w:lang w:val="en-US"/>
+        </w:rPr>
+        <w:t>returns random integer from given range (inclusive)</w:t>
+      </w:r>
+    </w:p>
+    <w:p>
+      <w:pPr>
+        <w:pStyle w:val="Heading4"/>
+        <w:rPr>
+          <w:lang w:val="en-US"/>
+        </w:rPr>
+      </w:pPr>
+      <w:r>
+        <w:rPr>
+          <w:lang w:val="en-US"/>
+        </w:rPr>
         <w:lastRenderedPageBreak/>
-        <w:t>set_seed</w:t>
-      </w:r>
-      <w:r>
-        <w:rPr>
-          <w:lang w:val="en-US"/>
-        </w:rPr>
-        <w:t>(Int)</w:t>
-      </w:r>
-    </w:p>
-    <w:p>
-      <w:pPr>
-        <w:pStyle w:val="ListParagraph"/>
-        <w:numPr>
-          <w:ilvl w:val="0"/>
-          <w:numId w:val="1"/>
-        </w:numPr>
-        <w:rPr>
-          <w:lang w:val="en-US"/>
-        </w:rPr>
-      </w:pPr>
-      <w:r>
-        <w:rPr>
-          <w:lang w:val="en-US"/>
-        </w:rPr>
-        <w:t>sets rng state</w:t>
-      </w:r>
-    </w:p>
-    <w:p>
-      <w:pPr>
-        <w:rPr>
-          <w:lang w:val="en-US"/>
-        </w:rPr>
-      </w:pPr>
-    </w:p>
-    <w:p>
-      <w:pPr>
-        <w:pStyle w:val="Heading4"/>
-        <w:rPr>
-          <w:lang w:val="en-US"/>
-        </w:rPr>
-      </w:pPr>
-      <w:r>
-        <w:rPr>
-          <w:lang w:val="en-US"/>
-        </w:rPr>
-        <w:t>set_state</w:t>
-      </w:r>
-      <w:r>
-        <w:rPr>
-          <w:lang w:val="en-US"/>
-        </w:rPr>
-        <w:t>(Int)</w:t>
-      </w:r>
-    </w:p>
-    <w:p>
-      <w:pPr>
-        <w:pStyle w:val="ListParagraph"/>
-        <w:numPr>
-          <w:ilvl w:val="0"/>
-          <w:numId w:val="1"/>
-        </w:numPr>
-        <w:rPr>
-          <w:lang w:val="en-US"/>
-        </w:rPr>
-      </w:pPr>
-      <w:r>
-        <w:rPr>
-          <w:lang w:val="en-US"/>
-        </w:rPr>
-        <w:t>sets rng state</w:t>
-      </w:r>
-    </w:p>
-    <w:p>
-      <w:pPr>
-        <w:pStyle w:val="Heading4"/>
-        <w:rPr>
-          <w:lang w:val="en-US"/>
-        </w:rPr>
-      </w:pPr>
-      <w:r>
-        <w:rPr>
-          <w:lang w:val="en-US"/>
-        </w:rPr>
-        <w:t>pick_from</w:t>
-      </w:r>
-      <w:r>
-        <w:rPr>
-          <w:lang w:val="en-US"/>
-        </w:rPr>
-        <w:t>(Array, Array)</w:t>
-      </w:r>
-    </w:p>
-    <w:p>
-      <w:pPr>
-        <w:pStyle w:val="ListParagraph"/>
-        <w:numPr>
-          <w:ilvl w:val="0"/>
-          <w:numId w:val="1"/>
-        </w:numPr>
-        <w:rPr>
-          <w:lang w:val="en-US"/>
-        </w:rPr>
-      </w:pPr>
-      <w:r>
-        <w:rPr>
-          <w:lang w:val="en-US"/>
-        </w:rPr>
-        <w:t>returns an object from an array</w:t>
-      </w:r>
-    </w:p>
-    <w:p>
-      <w:pPr>
-        <w:pStyle w:val="ListParagraph"/>
-        <w:numPr>
-          <w:ilvl w:val="0"/>
-          <w:numId w:val="1"/>
-        </w:numPr>
-        <w:rPr>
-          <w:lang w:val="en-US"/>
-        </w:rPr>
-      </w:pPr>
-      <w:r>
-        <w:rPr>
-          <w:lang w:val="en-US"/>
-        </w:rPr>
-        <w:t>can take in extra array for weights to do weighted randomization</w:t>
-      </w:r>
-    </w:p>
-    <w:p>
-      <w:pPr>
-        <w:pStyle w:val="Heading4"/>
-        <w:rPr>
-          <w:b/>
-          <w:lang w:val="en-US"/>
-        </w:rPr>
-      </w:pPr>
-      <w:r>
-        <w:rPr>
-          <w:lang w:val="en-US"/>
-        </w:rPr>
-        <w:t>randf</w:t>
+        <w:t>randomize</w:t>
       </w:r>
       <w:r>
         <w:rPr>
@@ -1333,115 +1881,252 @@
         <w:rPr>
           <w:lang w:val="en-US"/>
         </w:rPr>
-        <w:t>returns random float from 0 to 1</w:t>
-      </w:r>
-    </w:p>
-    <w:p>
-      <w:pPr>
-        <w:pStyle w:val="Heading4"/>
-        <w:rPr>
-          <w:lang w:val="en-US"/>
-        </w:rPr>
-      </w:pPr>
-      <w:r>
-        <w:rPr>
-          <w:lang w:val="en-US"/>
-        </w:rPr>
-        <w:t>randf_range</w:t>
-      </w:r>
-      <w:r>
-        <w:rPr>
-          <w:lang w:val="en-US"/>
-        </w:rPr>
-        <w:t>(Float, Float)</w:t>
-      </w:r>
-    </w:p>
-    <w:p>
-      <w:pPr>
-        <w:pStyle w:val="ListParagraph"/>
-        <w:numPr>
-          <w:ilvl w:val="0"/>
-          <w:numId w:val="1"/>
-        </w:numPr>
-        <w:rPr>
-          <w:lang w:val="en-US"/>
-        </w:rPr>
-      </w:pPr>
-      <w:r>
-        <w:rPr>
-          <w:lang w:val="en-US"/>
-        </w:rPr>
-        <w:t>returns random float from given range (inclusive)</w:t>
-      </w:r>
-    </w:p>
-    <w:p>
-      <w:pPr>
-        <w:pStyle w:val="Heading4"/>
-        <w:rPr>
-          <w:lang w:val="en-US"/>
-        </w:rPr>
-      </w:pPr>
-      <w:r>
-        <w:rPr>
-          <w:lang w:val="en-US"/>
-        </w:rPr>
-        <w:t>randfn</w:t>
-      </w:r>
-      <w:r>
-        <w:rPr>
-          <w:lang w:val="en-US"/>
-        </w:rPr>
-        <w:t>(Float, Float)</w:t>
-      </w:r>
-    </w:p>
-    <w:p>
-      <w:pPr>
-        <w:pStyle w:val="ListParagraph"/>
-        <w:numPr>
-          <w:ilvl w:val="0"/>
-          <w:numId w:val="1"/>
-        </w:numPr>
-        <w:rPr>
-          <w:lang w:val="en-US"/>
-        </w:rPr>
-      </w:pPr>
-      <w:r>
-        <w:rPr>
-          <w:lang w:val="en-US"/>
-        </w:rPr>
-        <w:t>returns random float with normal distribution probability</w:t>
-      </w:r>
-    </w:p>
-    <w:p>
-      <w:pPr>
-        <w:pStyle w:val="ListParagraph"/>
-        <w:numPr>
-          <w:ilvl w:val="0"/>
-          <w:numId w:val="1"/>
-        </w:numPr>
-        <w:rPr>
-          <w:lang w:val="en-US"/>
-        </w:rPr>
-      </w:pPr>
-      <w:r>
-        <w:rPr>
-          <w:lang w:val="en-US"/>
-        </w:rPr>
-        <w:t>can take in mean and deviation inputs</w:t>
-      </w:r>
-    </w:p>
-    <w:p>
-      <w:pPr>
-        <w:pStyle w:val="Heading4"/>
-        <w:rPr>
-          <w:lang w:val="en-US"/>
-        </w:rPr>
-      </w:pPr>
-      <w:r>
-        <w:rPr>
-          <w:lang w:val="en-US"/>
-        </w:rPr>
-        <w:t>randi</w:t>
+        <w:t>randomizes rng seed</w:t>
+      </w:r>
+    </w:p>
+    <w:p>
+      <w:pPr>
+        <w:pStyle w:val="Heading1"/>
+        <w:rPr>
+          <w:lang w:val="en-US"/>
+        </w:rPr>
+      </w:pPr>
+      <w:r>
+        <w:rPr>
+          <w:lang w:val="en-US"/>
+        </w:rPr>
+        <w:t>Static Objects</w:t>
+      </w:r>
+    </w:p>
+    <w:p>
+      <w:pPr>
+        <w:pStyle w:val="Heading2"/>
+        <w:rPr>
+          <w:lang w:val="en-US"/>
+        </w:rPr>
+      </w:pPr>
+      <w:r>
+        <w:rPr>
+          <w:lang w:val="en-US"/>
+        </w:rPr>
+        <w:t>ActionBoard</w:t>
+      </w:r>
+    </w:p>
+    <w:p>
+      <w:pPr>
+        <w:pStyle w:val="Heading3"/>
+        <w:rPr>
+          <w:lang w:val="en-US"/>
+        </w:rPr>
+      </w:pPr>
+      <w:r>
+        <w:rPr>
+          <w:lang w:val="en-US"/>
+        </w:rPr>
+        <w:t>Variables</w:t>
+      </w:r>
+    </w:p>
+    <w:p>
+      <w:pPr>
+        <w:pStyle w:val="Heading4"/>
+        <w:rPr>
+          <w:lang w:val="en-US"/>
+        </w:rPr>
+      </w:pPr>
+      <w:r>
+        <w:rPr>
+          <w:lang w:val="en-US"/>
+        </w:rPr>
+        <w:t>nodes</w:t>
+      </w:r>
+    </w:p>
+    <w:p>
+      <w:pPr>
+        <w:pStyle w:val="Heading4"/>
+        <w:rPr>
+          <w:lang w:val="en-US"/>
+        </w:rPr>
+      </w:pPr>
+      <w:r>
+        <w:rPr>
+          <w:lang w:val="en-US"/>
+        </w:rPr>
+        <w:t>orbs</w:t>
+      </w:r>
+    </w:p>
+    <w:p>
+      <w:pPr>
+        <w:pStyle w:val="Heading4"/>
+        <w:rPr>
+          <w:lang w:val="en-US"/>
+        </w:rPr>
+      </w:pPr>
+      <w:r>
+        <w:rPr>
+          <w:lang w:val="en-US"/>
+        </w:rPr>
+        <w:t>temp_orb_asset_paths</w:t>
+      </w:r>
+    </w:p>
+    <w:p>
+      <w:pPr>
+        <w:pStyle w:val="Heading4"/>
+        <w:rPr>
+          <w:lang w:val="en-US"/>
+        </w:rPr>
+      </w:pPr>
+      <w:r>
+        <w:rPr>
+          <w:lang w:val="en-US"/>
+        </w:rPr>
+        <w:t>new_orb_scene</w:t>
+      </w:r>
+    </w:p>
+    <w:p>
+      <w:pPr>
+        <w:pStyle w:val="Heading4"/>
+        <w:rPr>
+          <w:lang w:val="en-US"/>
+        </w:rPr>
+      </w:pPr>
+      <w:r>
+        <w:rPr>
+          <w:lang w:val="en-US"/>
+        </w:rPr>
+        <w:t>turn_manager</w:t>
+      </w:r>
+    </w:p>
+    <w:p>
+      <w:pPr>
+        <w:pStyle w:val="Heading4"/>
+        <w:rPr>
+          <w:lang w:val="en-US"/>
+        </w:rPr>
+      </w:pPr>
+      <w:r>
+        <w:rPr>
+          <w:lang w:val="en-US"/>
+        </w:rPr>
+        <w:t>node_link</w:t>
+      </w:r>
+    </w:p>
+    <w:p>
+      <w:pPr>
+        <w:pStyle w:val="Heading4"/>
+        <w:rPr>
+          <w:lang w:val="en-US"/>
+        </w:rPr>
+      </w:pPr>
+      <w:r>
+        <w:rPr>
+          <w:lang w:val="en-US"/>
+        </w:rPr>
+        <w:t>orb_link</w:t>
+      </w:r>
+    </w:p>
+    <w:p>
+      <w:pPr>
+        <w:pStyle w:val="Heading4"/>
+        <w:rPr>
+          <w:lang w:val="en-US"/>
+        </w:rPr>
+      </w:pPr>
+      <w:r>
+        <w:rPr>
+          <w:lang w:val="en-US"/>
+        </w:rPr>
+        <w:t>turn_actions</w:t>
+      </w:r>
+    </w:p>
+    <w:p>
+      <w:pPr>
+        <w:pStyle w:val="Heading4"/>
+        <w:rPr>
+          <w:lang w:val="en-US"/>
+        </w:rPr>
+      </w:pPr>
+      <w:r>
+        <w:rPr>
+          <w:lang w:val="en-US"/>
+        </w:rPr>
+        <w:t>target_orb</w:t>
+      </w:r>
+    </w:p>
+    <w:p>
+      <w:pPr>
+        <w:rPr>
+          <w:lang w:val="en-US"/>
+        </w:rPr>
+      </w:pPr>
+    </w:p>
+    <w:p>
+      <w:pPr>
+        <w:pStyle w:val="Heading3"/>
+        <w:rPr>
+          <w:lang w:val="en-US"/>
+        </w:rPr>
+      </w:pPr>
+      <w:r>
+        <w:rPr>
+          <w:lang w:val="en-US"/>
+        </w:rPr>
+        <w:t>Methods</w:t>
+      </w:r>
+    </w:p>
+    <w:p>
+      <w:pPr>
+        <w:pStyle w:val="Heading4"/>
+        <w:rPr>
+          <w:lang w:val="en-US"/>
+        </w:rPr>
+      </w:pPr>
+      <w:r>
+        <w:rPr>
+          <w:lang w:val="en-US"/>
+        </w:rPr>
+        <w:t>ready()</w:t>
+      </w:r>
+    </w:p>
+    <w:p>
+      <w:pPr>
+        <w:pStyle w:val="Heading4"/>
+        <w:rPr>
+          <w:lang w:val="en-US"/>
+        </w:rPr>
+      </w:pPr>
+      <w:r>
+        <w:rPr>
+          <w:lang w:val="en-US"/>
+        </w:rPr>
+        <w:t>regenerateBoard()</w:t>
+      </w:r>
+    </w:p>
+    <w:p>
+      <w:pPr>
+        <w:pStyle w:val="Heading4"/>
+        <w:rPr>
+          <w:lang w:val="en-US"/>
+        </w:rPr>
+      </w:pPr>
+      <w:r>
+        <w:rPr>
+          <w:lang w:val="en-US"/>
+        </w:rPr>
+        <w:t>resolveBoard()</w:t>
+      </w:r>
+    </w:p>
+    <w:p>
+      <w:pPr>
+        <w:pStyle w:val="Heading4"/>
+        <w:rPr>
+          <w:lang w:val="en-US"/>
+        </w:rPr>
+      </w:pPr>
+      <w:r>
+        <w:rPr>
+          <w:lang w:val="en-US"/>
+        </w:rPr>
+        <w:t>clearBoard</w:t>
       </w:r>
       <w:r>
         <w:rPr>
@@ -1452,123 +2137,110 @@
     </w:p>
     <w:p>
       <w:pPr>
-        <w:pStyle w:val="ListParagraph"/>
-        <w:numPr>
-          <w:ilvl w:val="0"/>
-          <w:numId w:val="1"/>
-        </w:numPr>
-        <w:rPr>
-          <w:lang w:val="en-US"/>
-        </w:rPr>
-      </w:pPr>
-      <w:r>
-        <w:rPr>
-          <w:lang w:val="en-US"/>
-        </w:rPr>
-        <w:t xml:space="preserve">returns random unsigned integer from 0 to </w:t>
-      </w:r>
-      <w:r>
-        <w:rPr>
-          <w:lang w:val="en-US"/>
-        </w:rPr>
-        <w:t>4294967295</w:t>
-      </w:r>
-      <w:r>
-        <w:rPr>
-          <w:lang w:val="en-US"/>
-        </w:rPr>
-        <w:t xml:space="preserve"> (2^32) inclusive</w:t>
-      </w:r>
-    </w:p>
-    <w:p>
-      <w:pPr>
-        <w:pStyle w:val="Heading4"/>
-        <w:rPr>
-          <w:lang w:val="en-US"/>
-        </w:rPr>
-      </w:pPr>
-      <w:r>
-        <w:rPr>
-          <w:lang w:val="en-US"/>
-        </w:rPr>
-        <w:t>randi_range</w:t>
-      </w:r>
-      <w:r>
-        <w:rPr>
-          <w:lang w:val="en-US"/>
-        </w:rPr>
-        <w:t>(Int, Int)</w:t>
-      </w:r>
-    </w:p>
-    <w:p>
-      <w:pPr>
-        <w:pStyle w:val="ListParagraph"/>
-        <w:numPr>
-          <w:ilvl w:val="0"/>
-          <w:numId w:val="1"/>
-        </w:numPr>
-        <w:rPr>
-          <w:lang w:val="en-US"/>
-        </w:rPr>
-      </w:pPr>
-      <w:r>
-        <w:rPr>
-          <w:lang w:val="en-US"/>
-        </w:rPr>
-        <w:t>returns random integer from given range (inclusive)</w:t>
-      </w:r>
-    </w:p>
-    <w:p>
-      <w:pPr>
-        <w:pStyle w:val="Heading4"/>
-        <w:rPr>
-          <w:lang w:val="en-US"/>
-        </w:rPr>
-      </w:pPr>
-      <w:r>
-        <w:rPr>
-          <w:lang w:val="en-US"/>
-        </w:rPr>
-        <w:t>randomize</w:t>
-      </w:r>
-      <w:r>
-        <w:rPr>
-          <w:lang w:val="en-US"/>
-        </w:rPr>
-        <w:t>()</w:t>
-      </w:r>
-    </w:p>
-    <w:p>
-      <w:pPr>
-        <w:pStyle w:val="ListParagraph"/>
-        <w:numPr>
-          <w:ilvl w:val="0"/>
-          <w:numId w:val="1"/>
-        </w:numPr>
-        <w:rPr>
-          <w:lang w:val="en-US"/>
-        </w:rPr>
-      </w:pPr>
-      <w:r>
-        <w:rPr>
-          <w:lang w:val="en-US"/>
-        </w:rPr>
-        <w:t>randomizes rng seed</w:t>
-      </w:r>
-    </w:p>
-    <w:p>
-      <w:pPr>
-        <w:pStyle w:val="Heading1"/>
-        <w:rPr>
-          <w:lang w:val="en-US"/>
-        </w:rPr>
-      </w:pPr>
-      <w:r>
-        <w:rPr>
-          <w:lang w:val="en-US"/>
-        </w:rPr>
-        <w:t>Static Objects</w:t>
-      </w:r>
+        <w:pStyle w:val="Heading4"/>
+        <w:rPr>
+          <w:lang w:val="en-US"/>
+        </w:rPr>
+      </w:pPr>
+      <w:r>
+        <w:rPr>
+          <w:lang w:val="en-US"/>
+        </w:rPr>
+        <w:t>orbSwap</w:t>
+      </w:r>
+      <w:r>
+        <w:rPr>
+          <w:lang w:val="en-US"/>
+        </w:rPr>
+        <w:t>(Orb, Orb)</w:t>
+      </w:r>
+    </w:p>
+    <w:p>
+      <w:pPr>
+        <w:pStyle w:val="Heading4"/>
+        <w:rPr>
+          <w:lang w:val="en-US"/>
+        </w:rPr>
+      </w:pPr>
+      <w:r>
+        <w:rPr>
+          <w:lang w:val="en-US"/>
+        </w:rPr>
+        <w:t>orbDropped</w:t>
+      </w:r>
+      <w:r>
+        <w:rPr>
+          <w:lang w:val="en-US"/>
+        </w:rPr>
+        <w:t>(Orb)</w:t>
+      </w:r>
+    </w:p>
+    <w:p>
+      <w:pPr>
+        <w:pStyle w:val="Heading4"/>
+        <w:rPr>
+          <w:lang w:val="en-US"/>
+        </w:rPr>
+      </w:pPr>
+      <w:r>
+        <w:rPr>
+          <w:lang w:val="en-US"/>
+        </w:rPr>
+        <w:t>checkOrbMatches</w:t>
+      </w:r>
+      <w:r>
+        <w:rPr>
+          <w:lang w:val="en-US"/>
+        </w:rPr>
+        <w:t>(Orb)</w:t>
+      </w:r>
+    </w:p>
+    <w:p>
+      <w:pPr>
+        <w:pStyle w:val="Heading4"/>
+        <w:rPr>
+          <w:lang w:val="en-US"/>
+        </w:rPr>
+      </w:pPr>
+      <w:r>
+        <w:rPr>
+          <w:lang w:val="en-US"/>
+        </w:rPr>
+        <w:t>resolveOrbs</w:t>
+      </w:r>
+      <w:r>
+        <w:rPr>
+          <w:lang w:val="en-US"/>
+        </w:rPr>
+        <w:t>(Array)</w:t>
+      </w:r>
+    </w:p>
+    <w:p>
+      <w:pPr>
+        <w:pStyle w:val="Heading4"/>
+        <w:rPr>
+          <w:lang w:val="en-US"/>
+        </w:rPr>
+      </w:pPr>
+      <w:r>
+        <w:rPr>
+          <w:lang w:val="en-US"/>
+        </w:rPr>
+        <w:t>floodFill</w:t>
+      </w:r>
+      <w:r>
+        <w:rPr>
+          <w:lang w:val="en-US"/>
+        </w:rPr>
+        <w:t>(Vector2, Array, String)</w:t>
+      </w:r>
+    </w:p>
+    <w:p>
+      <w:pPr>
+        <w:rPr>
+          <w:lang w:val="en-US"/>
+        </w:rPr>
+      </w:pPr>
     </w:p>
     <w:p>
       <w:pPr>
@@ -1581,7 +2253,7 @@
         <w:rPr>
           <w:lang w:val="en-US"/>
         </w:rPr>
-        <w:t>ActionBoard</w:t>
+        <w:t>TurnManager</w:t>
       </w:r>
     </w:p>
     <w:p>
@@ -1609,119 +2281,77 @@
         <w:rPr>
           <w:lang w:val="en-US"/>
         </w:rPr>
-        <w:t>nodes</w:t>
-      </w:r>
-    </w:p>
-    <w:p>
-      <w:pPr>
-        <w:pStyle w:val="Heading4"/>
-        <w:rPr>
-          <w:lang w:val="en-US"/>
-        </w:rPr>
-      </w:pPr>
-      <w:r>
-        <w:rPr>
-          <w:lang w:val="en-US"/>
-        </w:rPr>
-        <w:t>orbs</w:t>
-      </w:r>
-    </w:p>
-    <w:p>
-      <w:pPr>
-        <w:pStyle w:val="Heading4"/>
-        <w:rPr>
-          <w:lang w:val="en-US"/>
-        </w:rPr>
-      </w:pPr>
-      <w:r>
-        <w:rPr>
-          <w:lang w:val="en-US"/>
-        </w:rPr>
-        <w:t>temp_orb_asset_paths</w:t>
-      </w:r>
-    </w:p>
-    <w:p>
-      <w:pPr>
-        <w:pStyle w:val="Heading4"/>
-        <w:rPr>
-          <w:lang w:val="en-US"/>
-        </w:rPr>
-      </w:pPr>
-      <w:r>
-        <w:rPr>
-          <w:lang w:val="en-US"/>
-        </w:rPr>
-        <w:t>new_orb_scene</w:t>
-      </w:r>
-    </w:p>
-    <w:p>
-      <w:pPr>
-        <w:pStyle w:val="Heading4"/>
-        <w:rPr>
-          <w:lang w:val="en-US"/>
-        </w:rPr>
-      </w:pPr>
-      <w:r>
-        <w:rPr>
-          <w:lang w:val="en-US"/>
-        </w:rPr>
-        <w:t>turn_manager</w:t>
-      </w:r>
-    </w:p>
-    <w:p>
-      <w:pPr>
-        <w:pStyle w:val="Heading4"/>
-        <w:rPr>
-          <w:lang w:val="en-US"/>
-        </w:rPr>
-      </w:pPr>
-      <w:r>
-        <w:rPr>
-          <w:lang w:val="en-US"/>
-        </w:rPr>
-        <w:t>node_link</w:t>
-      </w:r>
-    </w:p>
-    <w:p>
-      <w:pPr>
-        <w:pStyle w:val="Heading4"/>
-        <w:rPr>
-          <w:lang w:val="en-US"/>
-        </w:rPr>
-      </w:pPr>
-      <w:r>
-        <w:rPr>
-          <w:lang w:val="en-US"/>
-        </w:rPr>
-        <w:t>orb_link</w:t>
-      </w:r>
-    </w:p>
-    <w:p>
-      <w:pPr>
-        <w:pStyle w:val="Heading4"/>
-        <w:rPr>
-          <w:lang w:val="en-US"/>
-        </w:rPr>
-      </w:pPr>
-      <w:r>
-        <w:rPr>
-          <w:lang w:val="en-US"/>
-        </w:rPr>
-        <w:t>turn_actions</w:t>
-      </w:r>
-    </w:p>
-    <w:p>
-      <w:pPr>
-        <w:pStyle w:val="Heading4"/>
-        <w:rPr>
-          <w:lang w:val="en-US"/>
-        </w:rPr>
-      </w:pPr>
-      <w:r>
-        <w:rPr>
-          <w:lang w:val="en-US"/>
-        </w:rPr>
-        <w:t>target_orb</w:t>
+        <w:t>TURN</w:t>
+      </w:r>
+    </w:p>
+    <w:p>
+      <w:pPr>
+        <w:pStyle w:val="Heading4"/>
+        <w:rPr>
+          <w:lang w:val="en-US"/>
+        </w:rPr>
+      </w:pPr>
+      <w:r>
+        <w:rPr>
+          <w:lang w:val="en-US"/>
+        </w:rPr>
+        <w:t>player</w:t>
+      </w:r>
+    </w:p>
+    <w:p>
+      <w:pPr>
+        <w:pStyle w:val="Heading4"/>
+        <w:rPr>
+          <w:lang w:val="en-US"/>
+        </w:rPr>
+      </w:pPr>
+      <w:r>
+        <w:rPr>
+          <w:lang w:val="en-US"/>
+        </w:rPr>
+        <w:t>player_actions</w:t>
+      </w:r>
+    </w:p>
+    <w:p>
+      <w:pPr>
+        <w:pStyle w:val="Heading4"/>
+        <w:rPr>
+          <w:lang w:val="en-US"/>
+        </w:rPr>
+      </w:pPr>
+      <w:r>
+        <w:rPr>
+          <w:lang w:val="en-US"/>
+        </w:rPr>
+        <w:t>enemy</w:t>
+      </w:r>
+    </w:p>
+    <w:p>
+      <w:pPr>
+        <w:pStyle w:val="Heading4"/>
+        <w:rPr>
+          <w:lang w:val="en-US"/>
+        </w:rPr>
+      </w:pPr>
+      <w:r>
+        <w:rPr>
+          <w:lang w:val="en-US"/>
+        </w:rPr>
+        <w:t>battle_ongoing</w:t>
+      </w:r>
+    </w:p>
+    <w:p>
+      <w:pPr>
+        <w:pStyle w:val="Heading4"/>
+        <w:rPr>
+          <w:lang w:val="en-US"/>
+        </w:rPr>
+      </w:pPr>
+      <w:r>
+        <w:rPr>
+          <w:lang w:val="en-US"/>
+        </w:rPr>
+        <w:t>current_turn</w:t>
       </w:r>
     </w:p>
     <w:p>
@@ -1771,143 +2401,35 @@
         <w:rPr>
           <w:lang w:val="en-US"/>
         </w:rPr>
-        <w:t>regenerateBoard()</w:t>
-      </w:r>
-    </w:p>
-    <w:p>
-      <w:pPr>
-        <w:pStyle w:val="Heading4"/>
-        <w:rPr>
-          <w:lang w:val="en-US"/>
-        </w:rPr>
-      </w:pPr>
-      <w:r>
-        <w:rPr>
-          <w:lang w:val="en-US"/>
-        </w:rPr>
-        <w:t>resolveBoard()</w:t>
-      </w:r>
-    </w:p>
-    <w:p>
-      <w:pPr>
-        <w:pStyle w:val="Heading4"/>
-        <w:rPr>
-          <w:lang w:val="en-US"/>
-        </w:rPr>
-      </w:pPr>
-      <w:r>
-        <w:rPr>
-          <w:lang w:val="en-US"/>
-        </w:rPr>
-        <w:t>clearBoard</w:t>
-      </w:r>
-      <w:r>
-        <w:rPr>
-          <w:lang w:val="en-US"/>
-        </w:rPr>
-        <w:t>()</w:t>
-      </w:r>
-    </w:p>
-    <w:p>
-      <w:pPr>
-        <w:pStyle w:val="Heading4"/>
-        <w:rPr>
-          <w:lang w:val="en-US"/>
-        </w:rPr>
-      </w:pPr>
-      <w:r>
-        <w:rPr>
-          <w:lang w:val="en-US"/>
-        </w:rPr>
-        <w:t>orbSwap</w:t>
-      </w:r>
-      <w:r>
-        <w:rPr>
-          <w:lang w:val="en-US"/>
-        </w:rPr>
-        <w:t>(Orb, Orb)</w:t>
-      </w:r>
-    </w:p>
-    <w:p>
-      <w:pPr>
-        <w:pStyle w:val="Heading4"/>
-        <w:rPr>
-          <w:lang w:val="en-US"/>
-        </w:rPr>
-      </w:pPr>
-      <w:r>
-        <w:rPr>
-          <w:lang w:val="en-US"/>
-        </w:rPr>
-        <w:t>orbDropped</w:t>
-      </w:r>
-      <w:r>
-        <w:rPr>
-          <w:lang w:val="en-US"/>
-        </w:rPr>
-        <w:t>(Orb)</w:t>
-      </w:r>
-    </w:p>
-    <w:p>
-      <w:pPr>
-        <w:pStyle w:val="Heading4"/>
-        <w:rPr>
-          <w:lang w:val="en-US"/>
-        </w:rPr>
-      </w:pPr>
-      <w:r>
-        <w:rPr>
-          <w:lang w:val="en-US"/>
-        </w:rPr>
-        <w:t>checkOrbMatches</w:t>
-      </w:r>
-      <w:r>
-        <w:rPr>
-          <w:lang w:val="en-US"/>
-        </w:rPr>
-        <w:t>(Orb)</w:t>
-      </w:r>
-    </w:p>
-    <w:p>
-      <w:pPr>
-        <w:pStyle w:val="Heading4"/>
-        <w:rPr>
-          <w:lang w:val="en-US"/>
-        </w:rPr>
-      </w:pPr>
-      <w:r>
-        <w:rPr>
-          <w:lang w:val="en-US"/>
-        </w:rPr>
-        <w:t>resolveOrbs</w:t>
-      </w:r>
-      <w:r>
-        <w:rPr>
-          <w:lang w:val="en-US"/>
-        </w:rPr>
-        <w:t>(Array)</w:t>
-      </w:r>
-      <w:bookmarkStart w:id="0" w:name="_GoBack"/>
-      <w:bookmarkEnd w:id="0"/>
-    </w:p>
-    <w:p>
-      <w:pPr>
-        <w:pStyle w:val="Heading4"/>
-        <w:rPr>
-          <w:lang w:val="en-US"/>
-        </w:rPr>
-      </w:pPr>
-      <w:r>
-        <w:rPr>
-          <w:lang w:val="en-US"/>
-        </w:rPr>
-        <w:t>floodFill</w:t>
-      </w:r>
-      <w:r>
-        <w:rPr>
-          <w:lang w:val="en-US"/>
-        </w:rPr>
-        <w:t>(Vector2, Array, String)</w:t>
+        <w:t>start_battle(Entity, Entity)</w:t>
+      </w:r>
+    </w:p>
+    <w:p>
+      <w:pPr>
+        <w:pStyle w:val="Heading4"/>
+        <w:rPr>
+          <w:lang w:val="en-US"/>
+        </w:rPr>
+      </w:pPr>
+      <w:r>
+        <w:rPr>
+          <w:lang w:val="en-US"/>
+        </w:rPr>
+        <w:t>on_action_board_actions_populated(Array)</w:t>
+      </w:r>
+    </w:p>
+    <w:p>
+      <w:pPr>
+        <w:pStyle w:val="Heading4"/>
+        <w:rPr>
+          <w:lang w:val="en-US"/>
+        </w:rPr>
+      </w:pPr>
+      <w:r>
+        <w:rPr>
+          <w:lang w:val="en-US"/>
+        </w:rPr>
+        <w:t>entity_death(Entity)</w:t>
       </w:r>
     </w:p>
     <w:p>
@@ -1928,7 +2450,85 @@
         <w:rPr>
           <w:lang w:val="en-US"/>
         </w:rPr>
-        <w:t>TurnManager</w:t>
+        <w:t>PlayerBox</w:t>
+      </w:r>
+    </w:p>
+    <w:p>
+      <w:pPr>
+        <w:pStyle w:val="ListParagraph"/>
+        <w:numPr>
+          <w:ilvl w:val="0"/>
+          <w:numId w:val="1"/>
+        </w:numPr>
+        <w:rPr>
+          <w:lang w:val="en-US"/>
+        </w:rPr>
+      </w:pPr>
+      <w:r>
+        <w:rPr>
+          <w:lang w:val="en-US"/>
+        </w:rPr>
+        <w:t>see CustomControl</w:t>
+      </w:r>
+    </w:p>
+    <w:p>
+      <w:pPr>
+        <w:rPr>
+          <w:lang w:val="en-US"/>
+        </w:rPr>
+      </w:pPr>
+    </w:p>
+    <w:p>
+      <w:pPr>
+        <w:pStyle w:val="Heading2"/>
+        <w:rPr>
+          <w:lang w:val="en-US"/>
+        </w:rPr>
+      </w:pPr>
+      <w:r>
+        <w:rPr>
+          <w:lang w:val="en-US"/>
+        </w:rPr>
+        <w:t>EnemyBox</w:t>
+      </w:r>
+    </w:p>
+    <w:p>
+      <w:pPr>
+        <w:pStyle w:val="ListParagraph"/>
+        <w:numPr>
+          <w:ilvl w:val="0"/>
+          <w:numId w:val="1"/>
+        </w:numPr>
+        <w:rPr>
+          <w:lang w:val="en-US"/>
+        </w:rPr>
+      </w:pPr>
+      <w:r>
+        <w:rPr>
+          <w:lang w:val="en-US"/>
+        </w:rPr>
+        <w:t>see CustomControl</w:t>
+      </w:r>
+    </w:p>
+    <w:p>
+      <w:pPr>
+        <w:rPr>
+          <w:lang w:val="en-US"/>
+        </w:rPr>
+      </w:pPr>
+    </w:p>
+    <w:p>
+      <w:pPr>
+        <w:pStyle w:val="Heading2"/>
+        <w:rPr>
+          <w:lang w:val="en-US"/>
+        </w:rPr>
+      </w:pPr>
+      <w:r>
+        <w:rPr>
+          <w:lang w:val="en-US"/>
+        </w:rPr>
+        <w:t>Player</w:t>
       </w:r>
     </w:p>
     <w:p>
@@ -1942,6 +2542,97 @@
         <w:rPr>
           <w:lang w:val="en-US"/>
         </w:rPr>
+        <w:t>Methods</w:t>
+      </w:r>
+    </w:p>
+    <w:p>
+      <w:pPr>
+        <w:pStyle w:val="Heading4"/>
+        <w:rPr>
+          <w:lang w:val="en-US"/>
+        </w:rPr>
+      </w:pPr>
+      <w:r>
+        <w:rPr>
+          <w:lang w:val="en-US"/>
+        </w:rPr>
+        <w:t>ready()</w:t>
+      </w:r>
+    </w:p>
+    <w:p>
+      <w:pPr>
+        <w:pStyle w:val="Heading4"/>
+        <w:rPr>
+          <w:lang w:val="en-US"/>
+        </w:rPr>
+      </w:pPr>
+      <w:r>
+        <w:rPr>
+          <w:lang w:val="en-US"/>
+        </w:rPr>
+        <w:t>update_properties()</w:t>
+      </w:r>
+    </w:p>
+    <w:p>
+      <w:pPr>
+        <w:pStyle w:val="Heading4"/>
+        <w:rPr>
+          <w:lang w:val="en-US"/>
+        </w:rPr>
+      </w:pPr>
+      <w:r>
+        <w:rPr>
+          <w:lang w:val="en-US"/>
+        </w:rPr>
+        <w:t>turn_completed()</w:t>
+      </w:r>
+    </w:p>
+    <w:p>
+      <w:pPr>
+        <w:rPr>
+          <w:lang w:val="en-US"/>
+        </w:rPr>
+      </w:pPr>
+    </w:p>
+    <w:p>
+      <w:pPr>
+        <w:pStyle w:val="Heading1"/>
+        <w:rPr>
+          <w:lang w:val="en-US"/>
+        </w:rPr>
+      </w:pPr>
+      <w:r>
+        <w:rPr>
+          <w:lang w:val="en-US"/>
+        </w:rPr>
+        <w:t>Instanced Objects</w:t>
+      </w:r>
+    </w:p>
+    <w:p>
+      <w:pPr>
+        <w:pStyle w:val="Heading2"/>
+        <w:rPr>
+          <w:lang w:val="en-US"/>
+        </w:rPr>
+      </w:pPr>
+      <w:r>
+        <w:rPr>
+          <w:lang w:val="en-US"/>
+        </w:rPr>
+        <w:t>Orb</w:t>
+      </w:r>
+    </w:p>
+    <w:p>
+      <w:pPr>
+        <w:pStyle w:val="Heading3"/>
+        <w:rPr>
+          <w:lang w:val="en-US"/>
+        </w:rPr>
+      </w:pPr>
+      <w:r>
+        <w:rPr>
+          <w:lang w:val="en-US"/>
+        </w:rPr>
         <w:t>Variables</w:t>
       </w:r>
     </w:p>
@@ -1956,77 +2647,119 @@
         <w:rPr>
           <w:lang w:val="en-US"/>
         </w:rPr>
-        <w:t>TURN</w:t>
-      </w:r>
-    </w:p>
-    <w:p>
-      <w:pPr>
-        <w:pStyle w:val="Heading4"/>
-        <w:rPr>
-          <w:lang w:val="en-US"/>
-        </w:rPr>
-      </w:pPr>
-      <w:r>
-        <w:rPr>
-          <w:lang w:val="en-US"/>
-        </w:rPr>
-        <w:t>player</w:t>
-      </w:r>
-    </w:p>
-    <w:p>
-      <w:pPr>
-        <w:pStyle w:val="Heading4"/>
-        <w:rPr>
-          <w:lang w:val="en-US"/>
-        </w:rPr>
-      </w:pPr>
-      <w:r>
-        <w:rPr>
-          <w:lang w:val="en-US"/>
-        </w:rPr>
-        <w:t>player_actions</w:t>
-      </w:r>
-    </w:p>
-    <w:p>
-      <w:pPr>
-        <w:pStyle w:val="Heading4"/>
-        <w:rPr>
-          <w:lang w:val="en-US"/>
-        </w:rPr>
-      </w:pPr>
-      <w:r>
-        <w:rPr>
-          <w:lang w:val="en-US"/>
-        </w:rPr>
-        <w:t>enemy</w:t>
-      </w:r>
-    </w:p>
-    <w:p>
-      <w:pPr>
-        <w:pStyle w:val="Heading4"/>
-        <w:rPr>
-          <w:lang w:val="en-US"/>
-        </w:rPr>
-      </w:pPr>
-      <w:r>
-        <w:rPr>
-          <w:lang w:val="en-US"/>
-        </w:rPr>
-        <w:t>battle_ongoing</w:t>
-      </w:r>
-    </w:p>
-    <w:p>
-      <w:pPr>
-        <w:pStyle w:val="Heading4"/>
-        <w:rPr>
-          <w:lang w:val="en-US"/>
-        </w:rPr>
-      </w:pPr>
-      <w:r>
-        <w:rPr>
-          <w:lang w:val="en-US"/>
-        </w:rPr>
-        <w:t>current_turn</w:t>
+        <w:t>TYPE</w:t>
+      </w:r>
+    </w:p>
+    <w:p>
+      <w:pPr>
+        <w:pStyle w:val="Heading4"/>
+        <w:rPr>
+          <w:lang w:val="en-US"/>
+        </w:rPr>
+      </w:pPr>
+      <w:r>
+        <w:rPr>
+          <w:lang w:val="en-US"/>
+        </w:rPr>
+        <w:t>COLOR</w:t>
+      </w:r>
+    </w:p>
+    <w:p>
+      <w:pPr>
+        <w:pStyle w:val="Heading4"/>
+        <w:rPr>
+          <w:lang w:val="en-US"/>
+        </w:rPr>
+      </w:pPr>
+      <w:r>
+        <w:rPr>
+          <w:lang w:val="en-US"/>
+        </w:rPr>
+        <w:t>hitbox</w:t>
+      </w:r>
+    </w:p>
+    <w:p>
+      <w:pPr>
+        <w:pStyle w:val="Heading4"/>
+        <w:rPr>
+          <w:lang w:val="en-US"/>
+        </w:rPr>
+      </w:pPr>
+      <w:r>
+        <w:rPr>
+          <w:lang w:val="en-US"/>
+        </w:rPr>
+        <w:t>orb_type</w:t>
+      </w:r>
+    </w:p>
+    <w:p>
+      <w:pPr>
+        <w:pStyle w:val="Heading4"/>
+        <w:rPr>
+          <w:lang w:val="en-US"/>
+        </w:rPr>
+      </w:pPr>
+      <w:r>
+        <w:rPr>
+          <w:lang w:val="en-US"/>
+        </w:rPr>
+        <w:t>orb_color</w:t>
+      </w:r>
+    </w:p>
+    <w:p>
+      <w:pPr>
+        <w:pStyle w:val="Heading4"/>
+        <w:rPr>
+          <w:lang w:val="en-US"/>
+        </w:rPr>
+      </w:pPr>
+      <w:r>
+        <w:rPr>
+          <w:lang w:val="en-US"/>
+        </w:rPr>
+        <w:t>board_position</w:t>
+      </w:r>
+    </w:p>
+    <w:p>
+      <w:pPr>
+        <w:pStyle w:val="Heading4"/>
+        <w:rPr>
+          <w:lang w:val="en-US"/>
+        </w:rPr>
+      </w:pPr>
+      <w:r>
+        <w:rPr>
+          <w:lang w:val="en-US"/>
+        </w:rPr>
+        <w:t>selectable</w:t>
+      </w:r>
+    </w:p>
+    <w:p>
+      <w:pPr>
+        <w:pStyle w:val="Heading4"/>
+        <w:rPr>
+          <w:lang w:val="en-US"/>
+        </w:rPr>
+      </w:pPr>
+      <w:r>
+        <w:rPr>
+          <w:lang w:val="en-US"/>
+        </w:rPr>
+        <w:t>selected</w:t>
+      </w:r>
+    </w:p>
+    <w:p>
+      <w:pPr>
+        <w:pStyle w:val="Heading4"/>
+        <w:rPr>
+          <w:lang w:val="en-US"/>
+        </w:rPr>
+      </w:pPr>
+      <w:r>
+        <w:rPr>
+          <w:lang w:val="en-US"/>
+        </w:rPr>
+        <w:t>resolved</w:t>
       </w:r>
     </w:p>
     <w:p>
@@ -2047,6 +2780,7 @@
         <w:rPr>
           <w:lang w:val="en-US"/>
         </w:rPr>
+        <w:lastRenderedPageBreak/>
         <w:t>Methods</w:t>
       </w:r>
     </w:p>
@@ -2075,35 +2809,105 @@
         <w:rPr>
           <w:lang w:val="en-US"/>
         </w:rPr>
-        <w:t>start_battle(Entity, Entity)</w:t>
-      </w:r>
-    </w:p>
-    <w:p>
-      <w:pPr>
-        <w:pStyle w:val="Heading4"/>
-        <w:rPr>
-          <w:lang w:val="en-US"/>
-        </w:rPr>
-      </w:pPr>
-      <w:r>
-        <w:rPr>
-          <w:lang w:val="en-US"/>
-        </w:rPr>
-        <w:t>on_action_board_actions_populated(Array)</w:t>
-      </w:r>
-    </w:p>
-    <w:p>
-      <w:pPr>
-        <w:pStyle w:val="Heading4"/>
-        <w:rPr>
-          <w:lang w:val="en-US"/>
-        </w:rPr>
-      </w:pPr>
-      <w:r>
-        <w:rPr>
-          <w:lang w:val="en-US"/>
-        </w:rPr>
-        <w:t>entity_death(Entity)</w:t>
+        <w:t>process(delta)</w:t>
+      </w:r>
+    </w:p>
+    <w:p>
+      <w:pPr>
+        <w:pStyle w:val="Heading4"/>
+        <w:rPr>
+          <w:lang w:val="en-US"/>
+        </w:rPr>
+      </w:pPr>
+      <w:r>
+        <w:rPr>
+          <w:lang w:val="en-US"/>
+        </w:rPr>
+        <w:t>on_hitbox_mouse_entered()</w:t>
+      </w:r>
+    </w:p>
+    <w:p>
+      <w:pPr>
+        <w:pStyle w:val="Heading4"/>
+        <w:rPr>
+          <w:lang w:val="en-US"/>
+        </w:rPr>
+      </w:pPr>
+      <w:r>
+        <w:rPr>
+          <w:lang w:val="en-US"/>
+        </w:rPr>
+        <w:t>on_hitbox_mouse_exited()</w:t>
+      </w:r>
+    </w:p>
+    <w:p>
+      <w:pPr>
+        <w:pStyle w:val="Heading4"/>
+        <w:rPr>
+          <w:lang w:val="en-US"/>
+        </w:rPr>
+      </w:pPr>
+      <w:r>
+        <w:rPr>
+          <w:lang w:val="en-US"/>
+        </w:rPr>
+        <w:t>on_hitbox_body_entered(body)</w:t>
+      </w:r>
+    </w:p>
+    <w:p>
+      <w:pPr>
+        <w:pStyle w:val="Heading4"/>
+        <w:rPr>
+          <w:lang w:val="en-US"/>
+        </w:rPr>
+      </w:pPr>
+      <w:r>
+        <w:rPr>
+          <w:lang w:val="en-US"/>
+        </w:rPr>
+        <w:t>newOrb(Int, image, Vector2)</w:t>
+      </w:r>
+    </w:p>
+    <w:p>
+      <w:pPr>
+        <w:pStyle w:val="Heading4"/>
+        <w:rPr>
+          <w:lang w:val="en-US"/>
+        </w:rPr>
+      </w:pPr>
+      <w:r>
+        <w:rPr>
+          <w:lang w:val="en-US"/>
+        </w:rPr>
+        <w:t>orb_selected(Orb)</w:t>
+      </w:r>
+    </w:p>
+    <w:p>
+      <w:pPr>
+        <w:pStyle w:val="Heading4"/>
+        <w:rPr>
+          <w:lang w:val="en-US"/>
+        </w:rPr>
+      </w:pPr>
+      <w:r>
+        <w:rPr>
+          <w:lang w:val="en-US"/>
+        </w:rPr>
+        <w:t>orb_dropped(Orb)</w:t>
+      </w:r>
+    </w:p>
+    <w:p>
+      <w:pPr>
+        <w:pStyle w:val="Heading4"/>
+        <w:rPr>
+          <w:lang w:val="en-US"/>
+        </w:rPr>
+      </w:pPr>
+      <w:r>
+        <w:rPr>
+          <w:lang w:val="en-US"/>
+        </w:rPr>
+        <w:t>moveTo(Vector2)</w:t>
       </w:r>
     </w:p>
     <w:p>
@@ -2124,25 +2928,49 @@
         <w:rPr>
           <w:lang w:val="en-US"/>
         </w:rPr>
-        <w:t>PlayerBox</w:t>
-      </w:r>
-    </w:p>
-    <w:p>
-      <w:pPr>
-        <w:pStyle w:val="ListParagraph"/>
-        <w:numPr>
-          <w:ilvl w:val="0"/>
-          <w:numId w:val="1"/>
-        </w:numPr>
-        <w:rPr>
-          <w:lang w:val="en-US"/>
-        </w:rPr>
-      </w:pPr>
-      <w:r>
-        <w:rPr>
-          <w:lang w:val="en-US"/>
-        </w:rPr>
-        <w:t>see CustomControl</w:t>
+        <w:t>HealthBar</w:t>
+      </w:r>
+    </w:p>
+    <w:p>
+      <w:pPr>
+        <w:pStyle w:val="Heading3"/>
+        <w:rPr>
+          <w:lang w:val="en-US"/>
+        </w:rPr>
+      </w:pPr>
+      <w:r>
+        <w:rPr>
+          <w:lang w:val="en-US"/>
+        </w:rPr>
+        <w:t>Methods</w:t>
+      </w:r>
+    </w:p>
+    <w:p>
+      <w:pPr>
+        <w:pStyle w:val="Heading4"/>
+        <w:rPr>
+          <w:lang w:val="en-US"/>
+        </w:rPr>
+      </w:pPr>
+      <w:r>
+        <w:rPr>
+          <w:lang w:val="en-US"/>
+        </w:rPr>
+        <w:t>ready()</w:t>
+      </w:r>
+    </w:p>
+    <w:p>
+      <w:pPr>
+        <w:pStyle w:val="Heading4"/>
+        <w:rPr>
+          <w:lang w:val="en-US"/>
+        </w:rPr>
+      </w:pPr>
+      <w:r>
+        <w:rPr>
+          <w:lang w:val="en-US"/>
+        </w:rPr>
+        <w:t>update_hp(Entity)</w:t>
       </w:r>
     </w:p>
     <w:p>
@@ -2163,37 +2991,180 @@
         <w:rPr>
           <w:lang w:val="en-US"/>
         </w:rPr>
-        <w:t>EnemyBox</w:t>
-      </w:r>
-    </w:p>
-    <w:p>
-      <w:pPr>
-        <w:pStyle w:val="ListParagraph"/>
-        <w:numPr>
-          <w:ilvl w:val="0"/>
-          <w:numId w:val="1"/>
-        </w:numPr>
-        <w:rPr>
-          <w:lang w:val="en-US"/>
-        </w:rPr>
-      </w:pPr>
-      <w:r>
-        <w:rPr>
-          <w:lang w:val="en-US"/>
-        </w:rPr>
-        <w:t>see CustomControl</w:t>
-      </w:r>
-    </w:p>
-    <w:p>
-      <w:pPr>
-        <w:rPr>
-          <w:lang w:val="en-US"/>
-        </w:rPr>
-      </w:pPr>
-    </w:p>
-    <w:p>
-      <w:pPr>
-        <w:pStyle w:val="Heading2"/>
+        <w:t>Enemy</w:t>
+      </w:r>
+    </w:p>
+    <w:p>
+      <w:pPr>
+        <w:pStyle w:val="Heading3"/>
+        <w:rPr>
+          <w:lang w:val="en-US"/>
+        </w:rPr>
+      </w:pPr>
+      <w:r>
+        <w:rPr>
+          <w:lang w:val="en-US"/>
+        </w:rPr>
+        <w:t>Variables</w:t>
+      </w:r>
+    </w:p>
+    <w:p>
+      <w:pPr>
+        <w:pStyle w:val="Heading4"/>
+        <w:rPr>
+          <w:lang w:val="en-US"/>
+        </w:rPr>
+      </w:pPr>
+      <w:r>
+        <w:rPr>
+          <w:lang w:val="en-US"/>
+        </w:rPr>
+        <w:t>action_roll</w:t>
+      </w:r>
+    </w:p>
+    <w:p>
+      <w:pPr>
+        <w:pStyle w:val="Heading4"/>
+        <w:rPr>
+          <w:lang w:val="en-US"/>
+        </w:rPr>
+      </w:pPr>
+      <w:r>
+        <w:rPr>
+          <w:lang w:val="en-US"/>
+        </w:rPr>
+        <w:t>attacks</w:t>
+      </w:r>
+    </w:p>
+    <w:p>
+      <w:pPr>
+        <w:pStyle w:val="Heading4"/>
+        <w:rPr>
+          <w:lang w:val="en-US"/>
+        </w:rPr>
+      </w:pPr>
+      <w:r>
+        <w:rPr>
+          <w:lang w:val="en-US"/>
+        </w:rPr>
+        <w:t>action_instances</w:t>
+      </w:r>
+    </w:p>
+    <w:p>
+      <w:pPr>
+        <w:pStyle w:val="Heading4"/>
+        <w:rPr>
+          <w:lang w:val="en-US"/>
+        </w:rPr>
+      </w:pPr>
+      <w:r>
+        <w:rPr>
+          <w:lang w:val="en-US"/>
+        </w:rPr>
+        <w:t>current_intent</w:t>
+      </w:r>
+    </w:p>
+    <w:p>
+      <w:pPr>
+        <w:rPr>
+          <w:lang w:val="en-US"/>
+        </w:rPr>
+      </w:pPr>
+    </w:p>
+    <w:p>
+      <w:pPr>
+        <w:pStyle w:val="Heading3"/>
+        <w:rPr>
+          <w:lang w:val="en-US"/>
+        </w:rPr>
+      </w:pPr>
+      <w:r>
+        <w:rPr>
+          <w:lang w:val="en-US"/>
+        </w:rPr>
+        <w:t>Methods</w:t>
+      </w:r>
+    </w:p>
+    <w:p>
+      <w:pPr>
+        <w:pStyle w:val="Heading4"/>
+        <w:rPr>
+          <w:lang w:val="en-US"/>
+        </w:rPr>
+      </w:pPr>
+      <w:r>
+        <w:rPr>
+          <w:lang w:val="en-US"/>
+        </w:rPr>
+        <w:t>ready()</w:t>
+      </w:r>
+    </w:p>
+    <w:p>
+      <w:pPr>
+        <w:pStyle w:val="Heading4"/>
+        <w:rPr>
+          <w:lang w:val="en-US"/>
+        </w:rPr>
+      </w:pPr>
+      <w:r>
+        <w:rPr>
+          <w:lang w:val="en-US"/>
+        </w:rPr>
+        <w:t>update_properties()</w:t>
+      </w:r>
+    </w:p>
+    <w:p>
+      <w:pPr>
+        <w:pStyle w:val="Heading4"/>
+        <w:rPr>
+          <w:lang w:val="en-US"/>
+        </w:rPr>
+      </w:pPr>
+      <w:r>
+        <w:rPr>
+          <w:lang w:val="en-US"/>
+        </w:rPr>
+        <w:t>decide_action()</w:t>
+      </w:r>
+    </w:p>
+    <w:p>
+      <w:pPr>
+        <w:pStyle w:val="Heading4"/>
+        <w:rPr>
+          <w:lang w:val="en-US"/>
+        </w:rPr>
+      </w:pPr>
+      <w:r>
+        <w:rPr>
+          <w:lang w:val="en-US"/>
+        </w:rPr>
+        <w:t>set_target(Array)</w:t>
+      </w:r>
+    </w:p>
+    <w:p>
+      <w:pPr>
+        <w:pStyle w:val="Heading4"/>
+        <w:rPr>
+          <w:lang w:val="en-US"/>
+        </w:rPr>
+      </w:pPr>
+      <w:r>
+        <w:rPr>
+          <w:lang w:val="en-US"/>
+        </w:rPr>
+        <w:t>resolve_action(ActionInstance)</w:t>
+      </w:r>
+    </w:p>
+    <w:p>
+      <w:pPr>
+        <w:rPr>
+          <w:lang w:val="en-US"/>
+        </w:rPr>
+      </w:pPr>
+    </w:p>
+    <w:p>
+      <w:pPr>
+        <w:pStyle w:val="Heading1"/>
         <w:rPr>
           <w:lang w:val="en-US"/>
         </w:rPr>
@@ -2203,651 +3174,6 @@
           <w:lang w:val="en-US"/>
         </w:rPr>
         <w:lastRenderedPageBreak/>
-        <w:t>Player</w:t>
-      </w:r>
-    </w:p>
-    <w:p>
-      <w:pPr>
-        <w:pStyle w:val="Heading3"/>
-        <w:rPr>
-          <w:lang w:val="en-US"/>
-        </w:rPr>
-      </w:pPr>
-      <w:r>
-        <w:rPr>
-          <w:lang w:val="en-US"/>
-        </w:rPr>
-        <w:t>Methods</w:t>
-      </w:r>
-    </w:p>
-    <w:p>
-      <w:pPr>
-        <w:pStyle w:val="Heading4"/>
-        <w:rPr>
-          <w:lang w:val="en-US"/>
-        </w:rPr>
-      </w:pPr>
-      <w:r>
-        <w:rPr>
-          <w:lang w:val="en-US"/>
-        </w:rPr>
-        <w:t>ready()</w:t>
-      </w:r>
-    </w:p>
-    <w:p>
-      <w:pPr>
-        <w:pStyle w:val="Heading4"/>
-        <w:rPr>
-          <w:lang w:val="en-US"/>
-        </w:rPr>
-      </w:pPr>
-      <w:r>
-        <w:rPr>
-          <w:lang w:val="en-US"/>
-        </w:rPr>
-        <w:t>update_properties()</w:t>
-      </w:r>
-    </w:p>
-    <w:p>
-      <w:pPr>
-        <w:pStyle w:val="Heading4"/>
-        <w:rPr>
-          <w:lang w:val="en-US"/>
-        </w:rPr>
-      </w:pPr>
-      <w:r>
-        <w:rPr>
-          <w:lang w:val="en-US"/>
-        </w:rPr>
-        <w:t>turn_completed()</w:t>
-      </w:r>
-    </w:p>
-    <w:p>
-      <w:pPr>
-        <w:rPr>
-          <w:lang w:val="en-US"/>
-        </w:rPr>
-      </w:pPr>
-    </w:p>
-    <w:p>
-      <w:pPr>
-        <w:pStyle w:val="Heading1"/>
-        <w:rPr>
-          <w:lang w:val="en-US"/>
-        </w:rPr>
-      </w:pPr>
-      <w:r>
-        <w:rPr>
-          <w:lang w:val="en-US"/>
-        </w:rPr>
-        <w:t>Instanced Objects</w:t>
-      </w:r>
-    </w:p>
-    <w:p>
-      <w:pPr>
-        <w:pStyle w:val="Heading2"/>
-        <w:rPr>
-          <w:lang w:val="en-US"/>
-        </w:rPr>
-      </w:pPr>
-      <w:r>
-        <w:rPr>
-          <w:lang w:val="en-US"/>
-        </w:rPr>
-        <w:t>Orb</w:t>
-      </w:r>
-    </w:p>
-    <w:p>
-      <w:pPr>
-        <w:pStyle w:val="Heading3"/>
-        <w:rPr>
-          <w:lang w:val="en-US"/>
-        </w:rPr>
-      </w:pPr>
-      <w:r>
-        <w:rPr>
-          <w:lang w:val="en-US"/>
-        </w:rPr>
-        <w:t>Variables</w:t>
-      </w:r>
-    </w:p>
-    <w:p>
-      <w:pPr>
-        <w:pStyle w:val="Heading4"/>
-        <w:rPr>
-          <w:lang w:val="en-US"/>
-        </w:rPr>
-      </w:pPr>
-      <w:r>
-        <w:rPr>
-          <w:lang w:val="en-US"/>
-        </w:rPr>
-        <w:t>TYPE</w:t>
-      </w:r>
-    </w:p>
-    <w:p>
-      <w:pPr>
-        <w:pStyle w:val="Heading4"/>
-        <w:rPr>
-          <w:lang w:val="en-US"/>
-        </w:rPr>
-      </w:pPr>
-      <w:r>
-        <w:rPr>
-          <w:lang w:val="en-US"/>
-        </w:rPr>
-        <w:t>COLOR</w:t>
-      </w:r>
-    </w:p>
-    <w:p>
-      <w:pPr>
-        <w:pStyle w:val="Heading4"/>
-        <w:rPr>
-          <w:lang w:val="en-US"/>
-        </w:rPr>
-      </w:pPr>
-      <w:r>
-        <w:rPr>
-          <w:lang w:val="en-US"/>
-        </w:rPr>
-        <w:t>hitbox</w:t>
-      </w:r>
-    </w:p>
-    <w:p>
-      <w:pPr>
-        <w:pStyle w:val="Heading4"/>
-        <w:rPr>
-          <w:lang w:val="en-US"/>
-        </w:rPr>
-      </w:pPr>
-      <w:r>
-        <w:rPr>
-          <w:lang w:val="en-US"/>
-        </w:rPr>
-        <w:t>orb_type</w:t>
-      </w:r>
-    </w:p>
-    <w:p>
-      <w:pPr>
-        <w:pStyle w:val="Heading4"/>
-        <w:rPr>
-          <w:lang w:val="en-US"/>
-        </w:rPr>
-      </w:pPr>
-      <w:r>
-        <w:rPr>
-          <w:lang w:val="en-US"/>
-        </w:rPr>
-        <w:t>orb_color</w:t>
-      </w:r>
-    </w:p>
-    <w:p>
-      <w:pPr>
-        <w:pStyle w:val="Heading4"/>
-        <w:rPr>
-          <w:lang w:val="en-US"/>
-        </w:rPr>
-      </w:pPr>
-      <w:r>
-        <w:rPr>
-          <w:lang w:val="en-US"/>
-        </w:rPr>
-        <w:t>board_position</w:t>
-      </w:r>
-    </w:p>
-    <w:p>
-      <w:pPr>
-        <w:pStyle w:val="Heading4"/>
-        <w:rPr>
-          <w:lang w:val="en-US"/>
-        </w:rPr>
-      </w:pPr>
-      <w:r>
-        <w:rPr>
-          <w:lang w:val="en-US"/>
-        </w:rPr>
-        <w:t>selectable</w:t>
-      </w:r>
-    </w:p>
-    <w:p>
-      <w:pPr>
-        <w:pStyle w:val="Heading4"/>
-        <w:rPr>
-          <w:lang w:val="en-US"/>
-        </w:rPr>
-      </w:pPr>
-      <w:r>
-        <w:rPr>
-          <w:lang w:val="en-US"/>
-        </w:rPr>
-        <w:t>selected</w:t>
-      </w:r>
-    </w:p>
-    <w:p>
-      <w:pPr>
-        <w:pStyle w:val="Heading4"/>
-        <w:rPr>
-          <w:lang w:val="en-US"/>
-        </w:rPr>
-      </w:pPr>
-      <w:r>
-        <w:rPr>
-          <w:lang w:val="en-US"/>
-        </w:rPr>
-        <w:t>resolved</w:t>
-      </w:r>
-    </w:p>
-    <w:p>
-      <w:pPr>
-        <w:rPr>
-          <w:lang w:val="en-US"/>
-        </w:rPr>
-      </w:pPr>
-    </w:p>
-    <w:p>
-      <w:pPr>
-        <w:pStyle w:val="Heading3"/>
-        <w:rPr>
-          <w:lang w:val="en-US"/>
-        </w:rPr>
-      </w:pPr>
-      <w:r>
-        <w:rPr>
-          <w:lang w:val="en-US"/>
-        </w:rPr>
-        <w:t>Methods</w:t>
-      </w:r>
-    </w:p>
-    <w:p>
-      <w:pPr>
-        <w:pStyle w:val="Heading4"/>
-        <w:rPr>
-          <w:lang w:val="en-US"/>
-        </w:rPr>
-      </w:pPr>
-      <w:r>
-        <w:rPr>
-          <w:lang w:val="en-US"/>
-        </w:rPr>
-        <w:t>ready()</w:t>
-      </w:r>
-    </w:p>
-    <w:p>
-      <w:pPr>
-        <w:pStyle w:val="Heading4"/>
-        <w:rPr>
-          <w:lang w:val="en-US"/>
-        </w:rPr>
-      </w:pPr>
-      <w:r>
-        <w:rPr>
-          <w:lang w:val="en-US"/>
-        </w:rPr>
-        <w:t>process(delta)</w:t>
-      </w:r>
-    </w:p>
-    <w:p>
-      <w:pPr>
-        <w:pStyle w:val="Heading4"/>
-        <w:rPr>
-          <w:lang w:val="en-US"/>
-        </w:rPr>
-      </w:pPr>
-      <w:r>
-        <w:rPr>
-          <w:lang w:val="en-US"/>
-        </w:rPr>
-        <w:t>on_hitbox_mouse_entered()</w:t>
-      </w:r>
-    </w:p>
-    <w:p>
-      <w:pPr>
-        <w:pStyle w:val="Heading4"/>
-        <w:rPr>
-          <w:lang w:val="en-US"/>
-        </w:rPr>
-      </w:pPr>
-      <w:r>
-        <w:rPr>
-          <w:lang w:val="en-US"/>
-        </w:rPr>
-        <w:t>on_hitbox_mouse_exited()</w:t>
-      </w:r>
-    </w:p>
-    <w:p>
-      <w:pPr>
-        <w:pStyle w:val="Heading4"/>
-        <w:rPr>
-          <w:lang w:val="en-US"/>
-        </w:rPr>
-      </w:pPr>
-      <w:r>
-        <w:rPr>
-          <w:lang w:val="en-US"/>
-        </w:rPr>
-        <w:t>on_hitbox_body_entered(body)</w:t>
-      </w:r>
-    </w:p>
-    <w:p>
-      <w:pPr>
-        <w:pStyle w:val="Heading4"/>
-        <w:rPr>
-          <w:lang w:val="en-US"/>
-        </w:rPr>
-      </w:pPr>
-      <w:r>
-        <w:rPr>
-          <w:lang w:val="en-US"/>
-        </w:rPr>
-        <w:t>newOrb(Int, image, Vector2)</w:t>
-      </w:r>
-    </w:p>
-    <w:p>
-      <w:pPr>
-        <w:pStyle w:val="Heading4"/>
-        <w:rPr>
-          <w:lang w:val="en-US"/>
-        </w:rPr>
-      </w:pPr>
-      <w:r>
-        <w:rPr>
-          <w:lang w:val="en-US"/>
-        </w:rPr>
-        <w:t>orb_selected(Orb)</w:t>
-      </w:r>
-    </w:p>
-    <w:p>
-      <w:pPr>
-        <w:pStyle w:val="Heading4"/>
-        <w:rPr>
-          <w:lang w:val="en-US"/>
-        </w:rPr>
-      </w:pPr>
-      <w:r>
-        <w:rPr>
-          <w:lang w:val="en-US"/>
-        </w:rPr>
-        <w:t>orb_dropped(Orb)</w:t>
-      </w:r>
-    </w:p>
-    <w:p>
-      <w:pPr>
-        <w:pStyle w:val="Heading4"/>
-        <w:rPr>
-          <w:lang w:val="en-US"/>
-        </w:rPr>
-      </w:pPr>
-      <w:r>
-        <w:rPr>
-          <w:lang w:val="en-US"/>
-        </w:rPr>
-        <w:t>moveTo(Vector2)</w:t>
-      </w:r>
-    </w:p>
-    <w:p>
-      <w:pPr>
-        <w:rPr>
-          <w:lang w:val="en-US"/>
-        </w:rPr>
-      </w:pPr>
-    </w:p>
-    <w:p>
-      <w:pPr>
-        <w:pStyle w:val="Heading2"/>
-        <w:rPr>
-          <w:lang w:val="en-US"/>
-        </w:rPr>
-      </w:pPr>
-      <w:r>
-        <w:rPr>
-          <w:lang w:val="en-US"/>
-        </w:rPr>
-        <w:t>HealthBar</w:t>
-      </w:r>
-    </w:p>
-    <w:p>
-      <w:pPr>
-        <w:pStyle w:val="Heading3"/>
-        <w:rPr>
-          <w:lang w:val="en-US"/>
-        </w:rPr>
-      </w:pPr>
-      <w:r>
-        <w:rPr>
-          <w:lang w:val="en-US"/>
-        </w:rPr>
-        <w:t>Methods</w:t>
-      </w:r>
-    </w:p>
-    <w:p>
-      <w:pPr>
-        <w:pStyle w:val="Heading4"/>
-        <w:rPr>
-          <w:lang w:val="en-US"/>
-        </w:rPr>
-      </w:pPr>
-      <w:r>
-        <w:rPr>
-          <w:lang w:val="en-US"/>
-        </w:rPr>
-        <w:t>ready()</w:t>
-      </w:r>
-    </w:p>
-    <w:p>
-      <w:pPr>
-        <w:pStyle w:val="Heading4"/>
-        <w:rPr>
-          <w:lang w:val="en-US"/>
-        </w:rPr>
-      </w:pPr>
-      <w:r>
-        <w:rPr>
-          <w:lang w:val="en-US"/>
-        </w:rPr>
-        <w:t>update_hp(Entity)</w:t>
-      </w:r>
-    </w:p>
-    <w:p>
-      <w:pPr>
-        <w:rPr>
-          <w:lang w:val="en-US"/>
-        </w:rPr>
-      </w:pPr>
-    </w:p>
-    <w:p>
-      <w:pPr>
-        <w:pStyle w:val="Heading2"/>
-        <w:rPr>
-          <w:lang w:val="en-US"/>
-        </w:rPr>
-      </w:pPr>
-      <w:r>
-        <w:rPr>
-          <w:lang w:val="en-US"/>
-        </w:rPr>
-        <w:lastRenderedPageBreak/>
-        <w:t>Enemy</w:t>
-      </w:r>
-    </w:p>
-    <w:p>
-      <w:pPr>
-        <w:pStyle w:val="Heading3"/>
-        <w:rPr>
-          <w:lang w:val="en-US"/>
-        </w:rPr>
-      </w:pPr>
-      <w:r>
-        <w:rPr>
-          <w:lang w:val="en-US"/>
-        </w:rPr>
-        <w:t>Variables</w:t>
-      </w:r>
-    </w:p>
-    <w:p>
-      <w:pPr>
-        <w:pStyle w:val="Heading4"/>
-        <w:rPr>
-          <w:lang w:val="en-US"/>
-        </w:rPr>
-      </w:pPr>
-      <w:r>
-        <w:rPr>
-          <w:lang w:val="en-US"/>
-        </w:rPr>
-        <w:t>action_roll</w:t>
-      </w:r>
-    </w:p>
-    <w:p>
-      <w:pPr>
-        <w:pStyle w:val="Heading4"/>
-        <w:rPr>
-          <w:lang w:val="en-US"/>
-        </w:rPr>
-      </w:pPr>
-      <w:r>
-        <w:rPr>
-          <w:lang w:val="en-US"/>
-        </w:rPr>
-        <w:t>attacks</w:t>
-      </w:r>
-    </w:p>
-    <w:p>
-      <w:pPr>
-        <w:pStyle w:val="Heading4"/>
-        <w:rPr>
-          <w:lang w:val="en-US"/>
-        </w:rPr>
-      </w:pPr>
-      <w:r>
-        <w:rPr>
-          <w:lang w:val="en-US"/>
-        </w:rPr>
-        <w:t>action_instances</w:t>
-      </w:r>
-    </w:p>
-    <w:p>
-      <w:pPr>
-        <w:pStyle w:val="Heading4"/>
-        <w:rPr>
-          <w:lang w:val="en-US"/>
-        </w:rPr>
-      </w:pPr>
-      <w:r>
-        <w:rPr>
-          <w:lang w:val="en-US"/>
-        </w:rPr>
-        <w:t>current_intent</w:t>
-      </w:r>
-    </w:p>
-    <w:p>
-      <w:pPr>
-        <w:rPr>
-          <w:lang w:val="en-US"/>
-        </w:rPr>
-      </w:pPr>
-    </w:p>
-    <w:p>
-      <w:pPr>
-        <w:pStyle w:val="Heading3"/>
-        <w:rPr>
-          <w:lang w:val="en-US"/>
-        </w:rPr>
-      </w:pPr>
-      <w:r>
-        <w:rPr>
-          <w:lang w:val="en-US"/>
-        </w:rPr>
-        <w:t>Methods</w:t>
-      </w:r>
-    </w:p>
-    <w:p>
-      <w:pPr>
-        <w:pStyle w:val="Heading4"/>
-        <w:rPr>
-          <w:lang w:val="en-US"/>
-        </w:rPr>
-      </w:pPr>
-      <w:r>
-        <w:rPr>
-          <w:lang w:val="en-US"/>
-        </w:rPr>
-        <w:t>ready()</w:t>
-      </w:r>
-    </w:p>
-    <w:p>
-      <w:pPr>
-        <w:pStyle w:val="Heading4"/>
-        <w:rPr>
-          <w:lang w:val="en-US"/>
-        </w:rPr>
-      </w:pPr>
-      <w:r>
-        <w:rPr>
-          <w:lang w:val="en-US"/>
-        </w:rPr>
-        <w:t>update_properties()</w:t>
-      </w:r>
-    </w:p>
-    <w:p>
-      <w:pPr>
-        <w:pStyle w:val="Heading4"/>
-        <w:rPr>
-          <w:lang w:val="en-US"/>
-        </w:rPr>
-      </w:pPr>
-      <w:r>
-        <w:rPr>
-          <w:lang w:val="en-US"/>
-        </w:rPr>
-        <w:t>decide_action()</w:t>
-      </w:r>
-    </w:p>
-    <w:p>
-      <w:pPr>
-        <w:pStyle w:val="Heading4"/>
-        <w:rPr>
-          <w:lang w:val="en-US"/>
-        </w:rPr>
-      </w:pPr>
-      <w:r>
-        <w:rPr>
-          <w:lang w:val="en-US"/>
-        </w:rPr>
-        <w:t>set_target(Array)</w:t>
-      </w:r>
-    </w:p>
-    <w:p>
-      <w:pPr>
-        <w:pStyle w:val="Heading4"/>
-        <w:rPr>
-          <w:lang w:val="en-US"/>
-        </w:rPr>
-      </w:pPr>
-      <w:r>
-        <w:rPr>
-          <w:lang w:val="en-US"/>
-        </w:rPr>
-        <w:t>resolve_action(ActionInstance)</w:t>
-      </w:r>
-    </w:p>
-    <w:p>
-      <w:pPr>
-        <w:rPr>
-          <w:lang w:val="en-US"/>
-        </w:rPr>
-      </w:pPr>
-    </w:p>
-    <w:p>
-      <w:pPr>
-        <w:pStyle w:val="Heading1"/>
-        <w:rPr>
-          <w:lang w:val="en-US"/>
-        </w:rPr>
-      </w:pPr>
-      <w:r>
-        <w:rPr>
-          <w:lang w:val="en-US"/>
-        </w:rPr>
         <w:t>UI</w:t>
       </w:r>
     </w:p>
@@ -3100,7 +3426,7 @@
 </file>
 
 <file path=word/numbering.xml><?xml version="1.0" encoding="utf-8"?>
-<w:numbering xmlns:wpc="http://schemas.microsoft.com/office/word/2010/wordprocessingCanvas" xmlns:cx="http://schemas.microsoft.com/office/drawing/2014/chartex" xmlns:cx1="http://schemas.microsoft.com/office/drawing/2015/9/8/chartex" xmlns:cx2="http://schemas.microsoft.com/office/drawing/2015/10/21/chartex" xmlns:cx3="http://schemas.microsoft.com/office/drawing/2016/5/9/chartex" xmlns:cx4="http://schemas.microsoft.com/office/drawing/2016/5/10/chartex" xmlns:cx5="http://schemas.microsoft.com/office/drawing/2016/5/11/chartex" xmlns:cx6="http://schemas.microsoft.com/office/drawing/2016/5/12/chartex" xmlns:cx7="http://schemas.microsoft.com/office/drawing/2016/5/13/chartex" xmlns:cx8="http://schemas.microsoft.com/office/drawing/2016/5/14/chartex" xmlns:mc="http://schemas.openxmlformats.org/markup-compatibility/2006" xmlns:aink="http://schemas.microsoft.com/office/drawing/2016/ink" xmlns:am3d="http://schemas.microsoft.com/office/drawing/2017/model3d" xmlns:o="urn:schemas-microsoft-com:office:office" xmlns:r="http://schemas.openxmlformats.org/officeDocument/2006/relationships" xmlns:m="http://schemas.openxmlformats.org/officeDocument/2006/math" xmlns:v="urn:schemas-microsoft-com:vml" xmlns:wp14="http://schemas.microsoft.com/office/word/2010/wordprocessingDrawing" xmlns:wp="http://schemas.openxmlformats.org/drawingml/2006/wordprocessingDrawing" xmlns:w10="urn:schemas-microsoft-com:office:word" xmlns:w="http://schemas.openxmlformats.org/wordprocessingml/2006/main" xmlns:w14="http://schemas.microsoft.com/office/word/2010/wordml" xmlns:w15="http://schemas.microsoft.com/office/word/2012/wordml" xmlns:w16cid="http://schemas.microsoft.com/office/word/2016/wordml/cid" xmlns:w16se="http://schemas.microsoft.com/office/word/2015/wordml/symex" xmlns:wpg="http://schemas.microsoft.com/office/word/2010/wordprocessingGroup" xmlns:wpi="http://schemas.microsoft.com/office/word/2010/wordprocessingInk" xmlns:wne="http://schemas.microsoft.com/office/word/2006/wordml" xmlns:wps="http://schemas.microsoft.com/office/word/2010/wordprocessingShape" mc:Ignorable="w14 w15 w16se w16cid wp14">
+<w:numbering xmlns:wpc="http://schemas.microsoft.com/office/word/2010/wordprocessingCanvas" xmlns:cx="http://schemas.microsoft.com/office/drawing/2014/chartex" xmlns:cx1="http://schemas.microsoft.com/office/drawing/2015/9/8/chartex" xmlns:cx2="http://schemas.microsoft.com/office/drawing/2015/10/21/chartex" xmlns:cx3="http://schemas.microsoft.com/office/drawing/2016/5/9/chartex" xmlns:cx4="http://schemas.microsoft.com/office/drawing/2016/5/10/chartex" xmlns:cx5="http://schemas.microsoft.com/office/drawing/2016/5/11/chartex" xmlns:cx6="http://schemas.microsoft.com/office/drawing/2016/5/12/chartex" xmlns:cx7="http://schemas.microsoft.com/office/drawing/2016/5/13/chartex" xmlns:cx8="http://schemas.microsoft.com/office/drawing/2016/5/14/chartex" xmlns:mc="http://schemas.openxmlformats.org/markup-compatibility/2006" xmlns:aink="http://schemas.microsoft.com/office/drawing/2016/ink" xmlns:am3d="http://schemas.microsoft.com/office/drawing/2017/model3d" xmlns:o="urn:schemas-microsoft-com:office:office" xmlns:oel="http://schemas.microsoft.com/office/2019/extlst" xmlns:r="http://schemas.openxmlformats.org/officeDocument/2006/relationships" xmlns:m="http://schemas.openxmlformats.org/officeDocument/2006/math" xmlns:v="urn:schemas-microsoft-com:vml" xmlns:wp14="http://schemas.microsoft.com/office/word/2010/wordprocessingDrawing" xmlns:wp="http://schemas.openxmlformats.org/drawingml/2006/wordprocessingDrawing" xmlns:w10="urn:schemas-microsoft-com:office:word" xmlns:w="http://schemas.openxmlformats.org/wordprocessingml/2006/main" xmlns:w14="http://schemas.microsoft.com/office/word/2010/wordml" xmlns:w15="http://schemas.microsoft.com/office/word/2012/wordml" xmlns:w16cex="http://schemas.microsoft.com/office/word/2018/wordml/cex" xmlns:w16cid="http://schemas.microsoft.com/office/word/2016/wordml/cid" xmlns:w16="http://schemas.microsoft.com/office/word/2018/wordml" xmlns:w16du="http://schemas.microsoft.com/office/word/2023/wordml/word16du" xmlns:w16sdtdh="http://schemas.microsoft.com/office/word/2020/wordml/sdtdatahash" xmlns:w16sdtfl="http://schemas.microsoft.com/office/word/2024/wordml/sdtformatlock" xmlns:w16se="http://schemas.microsoft.com/office/word/2015/wordml/symex" xmlns:wpg="http://schemas.microsoft.com/office/word/2010/wordprocessingGroup" xmlns:wpi="http://schemas.microsoft.com/office/word/2010/wordprocessingInk" xmlns:wne="http://schemas.microsoft.com/office/word/2006/wordml" xmlns:wps="http://schemas.microsoft.com/office/word/2010/wordprocessingShape" mc:Ignorable="w14 w15 w16se w16cid w16 w16cex w16sdtdh w16sdtfl w16du wp14">
   <w:abstractNum w:abstractNumId="0" w15:restartNumberingAfterBreak="0">
     <w:nsid w:val="13850BC5"/>
     <w:multiLevelType w:val="hybridMultilevel"/>
@@ -3325,17 +3651,17 @@
       </w:rPr>
     </w:lvl>
   </w:abstractNum>
-  <w:num w:numId="1">
+  <w:num w:numId="1" w16cid:durableId="36707161">
     <w:abstractNumId w:val="1"/>
   </w:num>
-  <w:num w:numId="2">
+  <w:num w:numId="2" w16cid:durableId="1612514495">
     <w:abstractNumId w:val="0"/>
   </w:num>
 </w:numbering>
 </file>
 
 <file path=word/styles.xml><?xml version="1.0" encoding="utf-8"?>
-<w:styles xmlns:mc="http://schemas.openxmlformats.org/markup-compatibility/2006" xmlns:r="http://schemas.openxmlformats.org/officeDocument/2006/relationships" xmlns:w="http://schemas.openxmlformats.org/wordprocessingml/2006/main" xmlns:w14="http://schemas.microsoft.com/office/word/2010/wordml" xmlns:w15="http://schemas.microsoft.com/office/word/2012/wordml" xmlns:w16cid="http://schemas.microsoft.com/office/word/2016/wordml/cid" xmlns:w16se="http://schemas.microsoft.com/office/word/2015/wordml/symex" mc:Ignorable="w14 w15 w16se w16cid">
+<w:styles xmlns:mc="http://schemas.openxmlformats.org/markup-compatibility/2006" xmlns:r="http://schemas.openxmlformats.org/officeDocument/2006/relationships" xmlns:w="http://schemas.openxmlformats.org/wordprocessingml/2006/main" xmlns:w14="http://schemas.microsoft.com/office/word/2010/wordml" xmlns:w15="http://schemas.microsoft.com/office/word/2012/wordml" xmlns:w16cex="http://schemas.microsoft.com/office/word/2018/wordml/cex" xmlns:w16cid="http://schemas.microsoft.com/office/word/2016/wordml/cid" xmlns:w16="http://schemas.microsoft.com/office/word/2018/wordml" xmlns:w16du="http://schemas.microsoft.com/office/word/2023/wordml/word16du" xmlns:w16sdtdh="http://schemas.microsoft.com/office/word/2020/wordml/sdtdatahash" xmlns:w16sdtfl="http://schemas.microsoft.com/office/word/2024/wordml/sdtformatlock" xmlns:w16se="http://schemas.microsoft.com/office/word/2015/wordml/symex" mc:Ignorable="w14 w15 w16se w16cid w16 w16cex w16sdtdh w16sdtfl w16du">
   <w:docDefaults>
     <w:rPrDefault>
       <w:rPr>
@@ -3351,7 +3677,7 @@
       </w:pPr>
     </w:pPrDefault>
   </w:docDefaults>
-  <w:latentStyles w:defLockedState="0" w:defUIPriority="99" w:defSemiHidden="0" w:defUnhideWhenUsed="0" w:defQFormat="0" w:count="375">
+  <w:latentStyles w:defLockedState="0" w:defUIPriority="99" w:defSemiHidden="0" w:defUnhideWhenUsed="0" w:defQFormat="0" w:count="376">
     <w:lsdException w:name="Normal" w:uiPriority="0" w:qFormat="1"/>
     <w:lsdException w:name="heading 1" w:uiPriority="9" w:qFormat="1"/>
     <w:lsdException w:name="heading 2" w:semiHidden="1" w:uiPriority="9" w:unhideWhenUsed="1" w:qFormat="1"/>
@@ -3727,6 +4053,7 @@
     <w:lsdException w:name="Smart Hyperlink" w:semiHidden="1" w:unhideWhenUsed="1"/>
     <w:lsdException w:name="Hashtag" w:semiHidden="1" w:unhideWhenUsed="1"/>
     <w:lsdException w:name="Unresolved Mention" w:semiHidden="1" w:unhideWhenUsed="1"/>
+    <w:lsdException w:name="Smart Link" w:semiHidden="1" w:unhideWhenUsed="1"/>
   </w:latentStyles>
   <w:style w:type="paragraph" w:default="1" w:styleId="Normal">
     <w:name w:val="Normal"/>

</xml_diff>